<commit_message>
feat: implement onboarding welcome screen and update project documentation
</commit_message>
<xml_diff>
--- a/RP2025-26_Cermak-Yumi.docx
+++ b/RP2025-26_Cermak-Yumi.docx
@@ -1027,19 +1027,7 @@
         <w:rPr>
           <w:lang w:eastAsia="en-US"/>
         </w:rPr>
-        <w:t xml:space="preserve">Práce se zabývá vývojem </w:t>
-      </w:r>
-      <w:r>
-        <w:rPr>
-          <w:lang w:eastAsia="en-US"/>
-        </w:rPr>
-        <w:t xml:space="preserve">multiplatformní </w:t>
-      </w:r>
-      <w:r>
-        <w:rPr>
-          <w:lang w:eastAsia="en-US"/>
-        </w:rPr>
-        <w:t xml:space="preserve">aplikace </w:t>
+        <w:t xml:space="preserve">Tato práce se zabývá vývojem multiplatformní aplikace. </w:t>
       </w:r>
       <w:proofErr w:type="spellStart"/>
       <w:r>
@@ -1053,7 +1041,73 @@
         <w:rPr>
           <w:lang w:eastAsia="en-US"/>
         </w:rPr>
-        <w:t xml:space="preserve"> pro sledování a analýzu nutričního příjmu v každodenním životě. Grafické vyobrazení aplikace je navrženo tak, aby bylo přehledné a motivující pro širokou veřejnost se zájmem o zdravý životní styl a vyváženou stravu. Aplikace je rozdělena na část pro záznam stravy, komunitní sekci s kluby a nástroje pro automatické rozpoznávání potravin. Práce také zahrnuje systém pro správu a aktualizaci databáze nutričních hodnot a mechanismy pro sdílení dosažených výsledků a aktivit mezi uživateli.</w:t>
+        <w:t xml:space="preserve"> s</w:t>
+      </w:r>
+      <w:r>
+        <w:rPr>
+          <w:lang w:eastAsia="en-US"/>
+        </w:rPr>
+        <w:t>louží ke sledování a analýzu nutričního příjmu v každodenním životě. Grafické navr</w:t>
+      </w:r>
+      <w:r>
+        <w:rPr>
+          <w:lang w:eastAsia="en-US"/>
+        </w:rPr>
+        <w:t>ž</w:t>
+      </w:r>
+      <w:r>
+        <w:rPr>
+          <w:lang w:eastAsia="en-US"/>
+        </w:rPr>
+        <w:t xml:space="preserve">ení aplikace (UI) je navrženo tak, aby bylo přehledné, přátelské a motivující pro lidi se zájmem o zdravý životní styl a zdravou stravu. Aplikace obsahuje přehlednou domovskou obrazovku, záznam stravy jak ručně i za pomocí AI pomocí fotky a na závěr komunitní sekci s kluby a přáteli. Práce také zahrnuje systém pro správu a aktualizaci databáze nutričních hodnot kde využívají open source API: </w:t>
+      </w:r>
+      <w:proofErr w:type="spellStart"/>
+      <w:r>
+        <w:rPr>
+          <w:lang w:val="en-GB" w:eastAsia="en-US"/>
+        </w:rPr>
+        <w:t>OpenFoodFacts</w:t>
+      </w:r>
+      <w:proofErr w:type="spellEnd"/>
+      <w:r>
+        <w:rPr>
+          <w:lang w:val="en-GB" w:eastAsia="en-US"/>
+        </w:rPr>
+        <w:t xml:space="preserve"> a </w:t>
+      </w:r>
+      <w:proofErr w:type="spellStart"/>
+      <w:proofErr w:type="gramStart"/>
+      <w:r>
+        <w:rPr>
+          <w:lang w:val="en-GB" w:eastAsia="en-US"/>
+        </w:rPr>
+        <w:t>FatSecret</w:t>
+      </w:r>
+      <w:proofErr w:type="spellEnd"/>
+      <w:r>
+        <w:rPr>
+          <w:lang w:eastAsia="en-US"/>
+        </w:rPr>
+        <w:t xml:space="preserve">  </w:t>
+      </w:r>
+      <w:r>
+        <w:rPr>
+          <w:lang w:eastAsia="en-US"/>
+        </w:rPr>
+        <w:t>a</w:t>
+      </w:r>
+      <w:proofErr w:type="gramEnd"/>
+      <w:r>
+        <w:rPr>
+          <w:lang w:eastAsia="en-US"/>
+        </w:rPr>
+        <w:t xml:space="preserve"> mechanismy pro sdílení dosažených výsledků a aktivit</w:t>
+      </w:r>
+      <w:r>
+        <w:rPr>
+          <w:lang w:eastAsia="en-US"/>
+        </w:rPr>
+        <w:t xml:space="preserve"> mezi uživateli.</w:t>
       </w:r>
     </w:p>
     <w:p>
@@ -1073,26 +1127,79 @@
     <w:p>
       <w:pPr>
         <w:pStyle w:val="Sta"/>
-      </w:pPr>
-      <w:r>
         <w:rPr>
-          <w:lang w:val="en"/>
+          <w:lang w:val="en-GB" w:eastAsia="en-US"/>
         </w:rPr>
-        <w:t xml:space="preserve">The thesis deals with the development of the Yumi mobile application for monitoring and analyzing nutritional intake in everyday life. The graphical representation of the application is designed to be clear and motivating for the </w:t>
-      </w:r>
-      <w:proofErr w:type="gramStart"/>
+      </w:pPr>
       <w:r>
         <w:rPr>
-          <w:lang w:val="en"/>
+          <w:lang w:val="en-GB" w:eastAsia="en-US"/>
         </w:rPr>
-        <w:t>general public</w:t>
-      </w:r>
-      <w:proofErr w:type="gramEnd"/>
+        <w:t xml:space="preserve">This thesis focuses on the development of a multiplatform application. Yumi is designed to track and </w:t>
+      </w:r>
+      <w:proofErr w:type="spellStart"/>
       <w:r>
         <w:rPr>
-          <w:lang w:val="en"/>
+          <w:lang w:val="en-GB" w:eastAsia="en-US"/>
         </w:rPr>
-        <w:t xml:space="preserve"> interested in a healthy lifestyle and a balanced diet. The application is divided into a section for recording food, a community section with clubs and tools for automatic food recognition. The thesis also includes a system for managing and updating the nutritional values ​​database and mechanisms for sharing achieved results and activities between users.</w:t>
+        <w:t>analyze</w:t>
+      </w:r>
+      <w:proofErr w:type="spellEnd"/>
+      <w:r>
+        <w:rPr>
+          <w:lang w:val="en-GB" w:eastAsia="en-US"/>
+        </w:rPr>
+        <w:t xml:space="preserve"> nutritional intake in everyday life. The application’s user interface (UI) is designed to be clear, user-friendly, and motivating for people interested in a healthy lifestyle and healthy eating. The application features a clear home screen, the ability to log meals both manually and using AI via photos, and a community section with clubs and friends. The thesis also includes a system for managing and updating a nutritional values database using open-source APIs—</w:t>
+      </w:r>
+      <w:proofErr w:type="spellStart"/>
+      <w:r>
+        <w:rPr>
+          <w:lang w:val="en-GB" w:eastAsia="en-US"/>
+        </w:rPr>
+        <w:t>OpenFoodFacts</w:t>
+      </w:r>
+      <w:proofErr w:type="spellEnd"/>
+      <w:r>
+        <w:rPr>
+          <w:lang w:val="en-GB" w:eastAsia="en-US"/>
+        </w:rPr>
+        <w:t xml:space="preserve"> and </w:t>
+      </w:r>
+      <w:proofErr w:type="spellStart"/>
+      <w:r>
+        <w:rPr>
+          <w:lang w:val="en-GB" w:eastAsia="en-US"/>
+        </w:rPr>
+        <w:t>FatSecret</w:t>
+      </w:r>
+      <w:proofErr w:type="spellEnd"/>
+      <w:r>
+        <w:rPr>
+          <w:lang w:val="en-GB" w:eastAsia="en-US"/>
+        </w:rPr>
+        <w:t>—as well as mechanisms for sharing results and activities among users.</w:t>
+      </w:r>
+    </w:p>
+    <w:p>
+      <w:pPr>
+        <w:pStyle w:val="Sta"/>
+        <w:rPr>
+          <w:lang w:val="en-GB" w:eastAsia="en-US"/>
+        </w:rPr>
+      </w:pPr>
+    </w:p>
+    <w:p>
+      <w:pPr>
+        <w:pStyle w:val="Sta"/>
+        <w:rPr>
+          <w:lang w:val="en-GB" w:eastAsia="en-US"/>
+        </w:rPr>
+      </w:pPr>
+      <w:r>
+        <w:rPr>
+          <w:lang w:val="en-GB" w:eastAsia="en-US"/>
+        </w:rPr>
+        <w:t>Translated with DeepL.com (free version)</w:t>
       </w:r>
     </w:p>
     <w:p>
@@ -1231,7 +1338,7 @@
           <w:r>
             <w:fldChar w:fldCharType="separate"/>
           </w:r>
-          <w:hyperlink w:anchor="_Toc227668186" w:history="1">
+          <w:hyperlink w:anchor="_Toc227677844" w:history="1">
             <w:r>
               <w:rPr>
                 <w:rStyle w:val="Hypertextovodkaz"/>
@@ -1258,7 +1365,7 @@
                 <w:noProof/>
                 <w:webHidden/>
               </w:rPr>
-              <w:instrText xml:space="preserve"> PAGEREF _Toc227668186 \h </w:instrText>
+              <w:instrText xml:space="preserve"> PAGEREF _Toc227677844 \h </w:instrText>
             </w:r>
             <w:r>
               <w:rPr>
@@ -1304,7 +1411,7 @@
               <w14:ligatures w14:val="standardContextual"/>
             </w:rPr>
           </w:pPr>
-          <w:hyperlink w:anchor="_Toc227668187" w:history="1">
+          <w:hyperlink w:anchor="_Toc227677845" w:history="1">
             <w:r>
               <w:rPr>
                 <w:rStyle w:val="Hypertextovodkaz"/>
@@ -1349,7 +1456,7 @@
                 <w:noProof/>
                 <w:webHidden/>
               </w:rPr>
-              <w:instrText xml:space="preserve"> PAGEREF _Toc227668187 \h </w:instrText>
+              <w:instrText xml:space="preserve"> PAGEREF _Toc227677845 \h </w:instrText>
             </w:r>
             <w:r>
               <w:rPr>
@@ -1392,7 +1499,7 @@
               <w14:ligatures w14:val="standardContextual"/>
             </w:rPr>
           </w:pPr>
-          <w:hyperlink w:anchor="_Toc227668188" w:history="1">
+          <w:hyperlink w:anchor="_Toc227677846" w:history="1">
             <w:r>
               <w:rPr>
                 <w:rStyle w:val="Hypertextovodkaz"/>
@@ -1437,7 +1544,7 @@
                 <w:noProof/>
                 <w:webHidden/>
               </w:rPr>
-              <w:instrText xml:space="preserve"> PAGEREF _Toc227668188 \h </w:instrText>
+              <w:instrText xml:space="preserve"> PAGEREF _Toc227677846 \h </w:instrText>
             </w:r>
             <w:r>
               <w:rPr>
@@ -1480,7 +1587,7 @@
               <w14:ligatures w14:val="standardContextual"/>
             </w:rPr>
           </w:pPr>
-          <w:hyperlink w:anchor="_Toc227668189" w:history="1">
+          <w:hyperlink w:anchor="_Toc227677847" w:history="1">
             <w:r>
               <w:rPr>
                 <w:rStyle w:val="Hypertextovodkaz"/>
@@ -1525,7 +1632,7 @@
                 <w:noProof/>
                 <w:webHidden/>
               </w:rPr>
-              <w:instrText xml:space="preserve"> PAGEREF _Toc227668189 \h </w:instrText>
+              <w:instrText xml:space="preserve"> PAGEREF _Toc227677847 \h </w:instrText>
             </w:r>
             <w:r>
               <w:rPr>
@@ -1568,7 +1675,7 @@
               <w14:ligatures w14:val="standardContextual"/>
             </w:rPr>
           </w:pPr>
-          <w:hyperlink w:anchor="_Toc227668190" w:history="1">
+          <w:hyperlink w:anchor="_Toc227677848" w:history="1">
             <w:r>
               <w:rPr>
                 <w:rStyle w:val="Hypertextovodkaz"/>
@@ -1613,7 +1720,7 @@
                 <w:noProof/>
                 <w:webHidden/>
               </w:rPr>
-              <w:instrText xml:space="preserve"> PAGEREF _Toc227668190 \h </w:instrText>
+              <w:instrText xml:space="preserve"> PAGEREF _Toc227677848 \h </w:instrText>
             </w:r>
             <w:r>
               <w:rPr>
@@ -1656,7 +1763,7 @@
               <w14:ligatures w14:val="standardContextual"/>
             </w:rPr>
           </w:pPr>
-          <w:hyperlink w:anchor="_Toc227668191" w:history="1">
+          <w:hyperlink w:anchor="_Toc227677849" w:history="1">
             <w:r>
               <w:rPr>
                 <w:rStyle w:val="Hypertextovodkaz"/>
@@ -1701,7 +1808,7 @@
                 <w:noProof/>
                 <w:webHidden/>
               </w:rPr>
-              <w:instrText xml:space="preserve"> PAGEREF _Toc227668191 \h </w:instrText>
+              <w:instrText xml:space="preserve"> PAGEREF _Toc227677849 \h </w:instrText>
             </w:r>
             <w:r>
               <w:rPr>
@@ -1747,7 +1854,7 @@
               <w14:ligatures w14:val="standardContextual"/>
             </w:rPr>
           </w:pPr>
-          <w:hyperlink w:anchor="_Toc227668192" w:history="1">
+          <w:hyperlink w:anchor="_Toc227677850" w:history="1">
             <w:r>
               <w:rPr>
                 <w:rStyle w:val="Hypertextovodkaz"/>
@@ -1771,7 +1878,7 @@
                 <w:rStyle w:val="Hypertextovodkaz"/>
                 <w:noProof/>
               </w:rPr>
-              <w:t>Vizuální identita a UX Design</w:t>
+              <w:t>Vizuální identita a UX Design (Figma)</w:t>
             </w:r>
             <w:r>
               <w:rPr>
@@ -1792,7 +1899,7 @@
                 <w:noProof/>
                 <w:webHidden/>
               </w:rPr>
-              <w:instrText xml:space="preserve"> PAGEREF _Toc227668192 \h </w:instrText>
+              <w:instrText xml:space="preserve"> PAGEREF _Toc227677850 \h </w:instrText>
             </w:r>
             <w:r>
               <w:rPr>
@@ -1835,7 +1942,7 @@
               <w14:ligatures w14:val="standardContextual"/>
             </w:rPr>
           </w:pPr>
-          <w:hyperlink w:anchor="_Toc227668193" w:history="1">
+          <w:hyperlink w:anchor="_Toc227677851" w:history="1">
             <w:r>
               <w:rPr>
                 <w:rStyle w:val="Hypertextovodkaz"/>
@@ -1880,7 +1987,7 @@
                 <w:noProof/>
                 <w:webHidden/>
               </w:rPr>
-              <w:instrText xml:space="preserve"> PAGEREF _Toc227668193 \h </w:instrText>
+              <w:instrText xml:space="preserve"> PAGEREF _Toc227677851 \h </w:instrText>
             </w:r>
             <w:r>
               <w:rPr>
@@ -1923,7 +2030,7 @@
               <w14:ligatures w14:val="standardContextual"/>
             </w:rPr>
           </w:pPr>
-          <w:hyperlink w:anchor="_Toc227668194" w:history="1">
+          <w:hyperlink w:anchor="_Toc227677852" w:history="1">
             <w:r>
               <w:rPr>
                 <w:rStyle w:val="Hypertextovodkaz"/>
@@ -1968,7 +2075,7 @@
                 <w:noProof/>
                 <w:webHidden/>
               </w:rPr>
-              <w:instrText xml:space="preserve"> PAGEREF _Toc227668194 \h </w:instrText>
+              <w:instrText xml:space="preserve"> PAGEREF _Toc227677852 \h </w:instrText>
             </w:r>
             <w:r>
               <w:rPr>
@@ -2011,7 +2118,7 @@
               <w14:ligatures w14:val="standardContextual"/>
             </w:rPr>
           </w:pPr>
-          <w:hyperlink w:anchor="_Toc227668195" w:history="1">
+          <w:hyperlink w:anchor="_Toc227677853" w:history="1">
             <w:r>
               <w:rPr>
                 <w:rStyle w:val="Hypertextovodkaz"/>
@@ -2056,7 +2163,7 @@
                 <w:noProof/>
                 <w:webHidden/>
               </w:rPr>
-              <w:instrText xml:space="preserve"> PAGEREF _Toc227668195 \h </w:instrText>
+              <w:instrText xml:space="preserve"> PAGEREF _Toc227677853 \h </w:instrText>
             </w:r>
             <w:r>
               <w:rPr>
@@ -2099,7 +2206,7 @@
               <w14:ligatures w14:val="standardContextual"/>
             </w:rPr>
           </w:pPr>
-          <w:hyperlink w:anchor="_Toc227668196" w:history="1">
+          <w:hyperlink w:anchor="_Toc227677854" w:history="1">
             <w:r>
               <w:rPr>
                 <w:rStyle w:val="Hypertextovodkaz"/>
@@ -2144,7 +2251,7 @@
                 <w:noProof/>
                 <w:webHidden/>
               </w:rPr>
-              <w:instrText xml:space="preserve"> PAGEREF _Toc227668196 \h </w:instrText>
+              <w:instrText xml:space="preserve"> PAGEREF _Toc227677854 \h </w:instrText>
             </w:r>
             <w:r>
               <w:rPr>
@@ -2190,7 +2297,7 @@
               <w14:ligatures w14:val="standardContextual"/>
             </w:rPr>
           </w:pPr>
-          <w:hyperlink w:anchor="_Toc227668197" w:history="1">
+          <w:hyperlink w:anchor="_Toc227677855" w:history="1">
             <w:r>
               <w:rPr>
                 <w:rStyle w:val="Hypertextovodkaz"/>
@@ -2235,7 +2342,7 @@
                 <w:noProof/>
                 <w:webHidden/>
               </w:rPr>
-              <w:instrText xml:space="preserve"> PAGEREF _Toc227668197 \h </w:instrText>
+              <w:instrText xml:space="preserve"> PAGEREF _Toc227677855 \h </w:instrText>
             </w:r>
             <w:r>
               <w:rPr>
@@ -2278,7 +2385,7 @@
               <w14:ligatures w14:val="standardContextual"/>
             </w:rPr>
           </w:pPr>
-          <w:hyperlink w:anchor="_Toc227668198" w:history="1">
+          <w:hyperlink w:anchor="_Toc227677856" w:history="1">
             <w:r>
               <w:rPr>
                 <w:rStyle w:val="Hypertextovodkaz"/>
@@ -2323,7 +2430,7 @@
                 <w:noProof/>
                 <w:webHidden/>
               </w:rPr>
-              <w:instrText xml:space="preserve"> PAGEREF _Toc227668198 \h </w:instrText>
+              <w:instrText xml:space="preserve"> PAGEREF _Toc227677856 \h </w:instrText>
             </w:r>
             <w:r>
               <w:rPr>
@@ -2366,7 +2473,7 @@
               <w14:ligatures w14:val="standardContextual"/>
             </w:rPr>
           </w:pPr>
-          <w:hyperlink w:anchor="_Toc227668199" w:history="1">
+          <w:hyperlink w:anchor="_Toc227677857" w:history="1">
             <w:r>
               <w:rPr>
                 <w:rStyle w:val="Hypertextovodkaz"/>
@@ -2411,7 +2518,7 @@
                 <w:noProof/>
                 <w:webHidden/>
               </w:rPr>
-              <w:instrText xml:space="preserve"> PAGEREF _Toc227668199 \h </w:instrText>
+              <w:instrText xml:space="preserve"> PAGEREF _Toc227677857 \h </w:instrText>
             </w:r>
             <w:r>
               <w:rPr>
@@ -2454,7 +2561,7 @@
               <w14:ligatures w14:val="standardContextual"/>
             </w:rPr>
           </w:pPr>
-          <w:hyperlink w:anchor="_Toc227668200" w:history="1">
+          <w:hyperlink w:anchor="_Toc227677858" w:history="1">
             <w:r>
               <w:rPr>
                 <w:rStyle w:val="Hypertextovodkaz"/>
@@ -2499,7 +2606,7 @@
                 <w:noProof/>
                 <w:webHidden/>
               </w:rPr>
-              <w:instrText xml:space="preserve"> PAGEREF _Toc227668200 \h </w:instrText>
+              <w:instrText xml:space="preserve"> PAGEREF _Toc227677858 \h </w:instrText>
             </w:r>
             <w:r>
               <w:rPr>
@@ -2542,7 +2649,7 @@
               <w14:ligatures w14:val="standardContextual"/>
             </w:rPr>
           </w:pPr>
-          <w:hyperlink w:anchor="_Toc227668201" w:history="1">
+          <w:hyperlink w:anchor="_Toc227677859" w:history="1">
             <w:r>
               <w:rPr>
                 <w:rStyle w:val="Hypertextovodkaz"/>
@@ -2587,7 +2694,7 @@
                 <w:noProof/>
                 <w:webHidden/>
               </w:rPr>
-              <w:instrText xml:space="preserve"> PAGEREF _Toc227668201 \h </w:instrText>
+              <w:instrText xml:space="preserve"> PAGEREF _Toc227677859 \h </w:instrText>
             </w:r>
             <w:r>
               <w:rPr>
@@ -2630,7 +2737,7 @@
               <w14:ligatures w14:val="standardContextual"/>
             </w:rPr>
           </w:pPr>
-          <w:hyperlink w:anchor="_Toc227668202" w:history="1">
+          <w:hyperlink w:anchor="_Toc227677860" w:history="1">
             <w:r>
               <w:rPr>
                 <w:rStyle w:val="Hypertextovodkaz"/>
@@ -2675,7 +2782,7 @@
                 <w:noProof/>
                 <w:webHidden/>
               </w:rPr>
-              <w:instrText xml:space="preserve"> PAGEREF _Toc227668202 \h </w:instrText>
+              <w:instrText xml:space="preserve"> PAGEREF _Toc227677860 \h </w:instrText>
             </w:r>
             <w:r>
               <w:rPr>
@@ -2718,7 +2825,7 @@
               <w14:ligatures w14:val="standardContextual"/>
             </w:rPr>
           </w:pPr>
-          <w:hyperlink w:anchor="_Toc227668203" w:history="1">
+          <w:hyperlink w:anchor="_Toc227677861" w:history="1">
             <w:r>
               <w:rPr>
                 <w:rStyle w:val="Hypertextovodkaz"/>
@@ -2763,7 +2870,7 @@
                 <w:noProof/>
                 <w:webHidden/>
               </w:rPr>
-              <w:instrText xml:space="preserve"> PAGEREF _Toc227668203 \h </w:instrText>
+              <w:instrText xml:space="preserve"> PAGEREF _Toc227677861 \h </w:instrText>
             </w:r>
             <w:r>
               <w:rPr>
@@ -2806,7 +2913,7 @@
               <w14:ligatures w14:val="standardContextual"/>
             </w:rPr>
           </w:pPr>
-          <w:hyperlink w:anchor="_Toc227668204" w:history="1">
+          <w:hyperlink w:anchor="_Toc227677862" w:history="1">
             <w:r>
               <w:rPr>
                 <w:rStyle w:val="Hypertextovodkaz"/>
@@ -2851,7 +2958,7 @@
                 <w:noProof/>
                 <w:webHidden/>
               </w:rPr>
-              <w:instrText xml:space="preserve"> PAGEREF _Toc227668204 \h </w:instrText>
+              <w:instrText xml:space="preserve"> PAGEREF _Toc227677862 \h </w:instrText>
             </w:r>
             <w:r>
               <w:rPr>
@@ -2894,7 +3001,7 @@
               <w14:ligatures w14:val="standardContextual"/>
             </w:rPr>
           </w:pPr>
-          <w:hyperlink w:anchor="_Toc227668205" w:history="1">
+          <w:hyperlink w:anchor="_Toc227677863" w:history="1">
             <w:r>
               <w:rPr>
                 <w:rStyle w:val="Hypertextovodkaz"/>
@@ -2939,7 +3046,7 @@
                 <w:noProof/>
                 <w:webHidden/>
               </w:rPr>
-              <w:instrText xml:space="preserve"> PAGEREF _Toc227668205 \h </w:instrText>
+              <w:instrText xml:space="preserve"> PAGEREF _Toc227677863 \h </w:instrText>
             </w:r>
             <w:r>
               <w:rPr>
@@ -2982,7 +3089,7 @@
               <w14:ligatures w14:val="standardContextual"/>
             </w:rPr>
           </w:pPr>
-          <w:hyperlink w:anchor="_Toc227668206" w:history="1">
+          <w:hyperlink w:anchor="_Toc227677864" w:history="1">
             <w:r>
               <w:rPr>
                 <w:rStyle w:val="Hypertextovodkaz"/>
@@ -3027,7 +3134,7 @@
                 <w:noProof/>
                 <w:webHidden/>
               </w:rPr>
-              <w:instrText xml:space="preserve"> PAGEREF _Toc227668206 \h </w:instrText>
+              <w:instrText xml:space="preserve"> PAGEREF _Toc227677864 \h </w:instrText>
             </w:r>
             <w:r>
               <w:rPr>
@@ -3070,7 +3177,7 @@
               <w14:ligatures w14:val="standardContextual"/>
             </w:rPr>
           </w:pPr>
-          <w:hyperlink w:anchor="_Toc227668207" w:history="1">
+          <w:hyperlink w:anchor="_Toc227677865" w:history="1">
             <w:r>
               <w:rPr>
                 <w:rStyle w:val="Hypertextovodkaz"/>
@@ -3115,7 +3222,7 @@
                 <w:noProof/>
                 <w:webHidden/>
               </w:rPr>
-              <w:instrText xml:space="preserve"> PAGEREF _Toc227668207 \h </w:instrText>
+              <w:instrText xml:space="preserve"> PAGEREF _Toc227677865 \h </w:instrText>
             </w:r>
             <w:r>
               <w:rPr>
@@ -3158,7 +3265,7 @@
               <w14:ligatures w14:val="standardContextual"/>
             </w:rPr>
           </w:pPr>
-          <w:hyperlink w:anchor="_Toc227668208" w:history="1">
+          <w:hyperlink w:anchor="_Toc227677866" w:history="1">
             <w:r>
               <w:rPr>
                 <w:rStyle w:val="Hypertextovodkaz"/>
@@ -3203,7 +3310,7 @@
                 <w:noProof/>
                 <w:webHidden/>
               </w:rPr>
-              <w:instrText xml:space="preserve"> PAGEREF _Toc227668208 \h </w:instrText>
+              <w:instrText xml:space="preserve"> PAGEREF _Toc227677866 \h </w:instrText>
             </w:r>
             <w:r>
               <w:rPr>
@@ -3246,7 +3353,7 @@
               <w14:ligatures w14:val="standardContextual"/>
             </w:rPr>
           </w:pPr>
-          <w:hyperlink w:anchor="_Toc227668209" w:history="1">
+          <w:hyperlink w:anchor="_Toc227677867" w:history="1">
             <w:r>
               <w:rPr>
                 <w:rStyle w:val="Hypertextovodkaz"/>
@@ -3291,7 +3398,7 @@
                 <w:noProof/>
                 <w:webHidden/>
               </w:rPr>
-              <w:instrText xml:space="preserve"> PAGEREF _Toc227668209 \h </w:instrText>
+              <w:instrText xml:space="preserve"> PAGEREF _Toc227677867 \h </w:instrText>
             </w:r>
             <w:r>
               <w:rPr>
@@ -3334,7 +3441,7 @@
               <w14:ligatures w14:val="standardContextual"/>
             </w:rPr>
           </w:pPr>
-          <w:hyperlink w:anchor="_Toc227668210" w:history="1">
+          <w:hyperlink w:anchor="_Toc227677868" w:history="1">
             <w:r>
               <w:rPr>
                 <w:rStyle w:val="Hypertextovodkaz"/>
@@ -3379,7 +3486,7 @@
                 <w:noProof/>
                 <w:webHidden/>
               </w:rPr>
-              <w:instrText xml:space="preserve"> PAGEREF _Toc227668210 \h </w:instrText>
+              <w:instrText xml:space="preserve"> PAGEREF _Toc227677868 \h </w:instrText>
             </w:r>
             <w:r>
               <w:rPr>
@@ -3422,7 +3529,7 @@
               <w14:ligatures w14:val="standardContextual"/>
             </w:rPr>
           </w:pPr>
-          <w:hyperlink w:anchor="_Toc227668211" w:history="1">
+          <w:hyperlink w:anchor="_Toc227677869" w:history="1">
             <w:r>
               <w:rPr>
                 <w:rStyle w:val="Hypertextovodkaz"/>
@@ -3467,7 +3574,7 @@
                 <w:noProof/>
                 <w:webHidden/>
               </w:rPr>
-              <w:instrText xml:space="preserve"> PAGEREF _Toc227668211 \h </w:instrText>
+              <w:instrText xml:space="preserve"> PAGEREF _Toc227677869 \h </w:instrText>
             </w:r>
             <w:r>
               <w:rPr>
@@ -3510,7 +3617,7 @@
               <w14:ligatures w14:val="standardContextual"/>
             </w:rPr>
           </w:pPr>
-          <w:hyperlink w:anchor="_Toc227668212" w:history="1">
+          <w:hyperlink w:anchor="_Toc227677870" w:history="1">
             <w:r>
               <w:rPr>
                 <w:rStyle w:val="Hypertextovodkaz"/>
@@ -3555,7 +3662,7 @@
                 <w:noProof/>
                 <w:webHidden/>
               </w:rPr>
-              <w:instrText xml:space="preserve"> PAGEREF _Toc227668212 \h </w:instrText>
+              <w:instrText xml:space="preserve"> PAGEREF _Toc227677870 \h </w:instrText>
             </w:r>
             <w:r>
               <w:rPr>
@@ -3598,7 +3705,7 @@
               <w14:ligatures w14:val="standardContextual"/>
             </w:rPr>
           </w:pPr>
-          <w:hyperlink w:anchor="_Toc227668213" w:history="1">
+          <w:hyperlink w:anchor="_Toc227677871" w:history="1">
             <w:r>
               <w:rPr>
                 <w:rStyle w:val="Hypertextovodkaz"/>
@@ -3643,7 +3750,7 @@
                 <w:noProof/>
                 <w:webHidden/>
               </w:rPr>
-              <w:instrText xml:space="preserve"> PAGEREF _Toc227668213 \h </w:instrText>
+              <w:instrText xml:space="preserve"> PAGEREF _Toc227677871 \h </w:instrText>
             </w:r>
             <w:r>
               <w:rPr>
@@ -3686,7 +3793,7 @@
               <w14:ligatures w14:val="standardContextual"/>
             </w:rPr>
           </w:pPr>
-          <w:hyperlink w:anchor="_Toc227668214" w:history="1">
+          <w:hyperlink w:anchor="_Toc227677872" w:history="1">
             <w:r>
               <w:rPr>
                 <w:rStyle w:val="Hypertextovodkaz"/>
@@ -3731,7 +3838,7 @@
                 <w:noProof/>
                 <w:webHidden/>
               </w:rPr>
-              <w:instrText xml:space="preserve"> PAGEREF _Toc227668214 \h </w:instrText>
+              <w:instrText xml:space="preserve"> PAGEREF _Toc227677872 \h </w:instrText>
             </w:r>
             <w:r>
               <w:rPr>
@@ -3774,7 +3881,7 @@
               <w14:ligatures w14:val="standardContextual"/>
             </w:rPr>
           </w:pPr>
-          <w:hyperlink w:anchor="_Toc227668215" w:history="1">
+          <w:hyperlink w:anchor="_Toc227677873" w:history="1">
             <w:r>
               <w:rPr>
                 <w:rStyle w:val="Hypertextovodkaz"/>
@@ -3819,7 +3926,7 @@
                 <w:noProof/>
                 <w:webHidden/>
               </w:rPr>
-              <w:instrText xml:space="preserve"> PAGEREF _Toc227668215 \h </w:instrText>
+              <w:instrText xml:space="preserve"> PAGEREF _Toc227677873 \h </w:instrText>
             </w:r>
             <w:r>
               <w:rPr>
@@ -3862,7 +3969,7 @@
               <w14:ligatures w14:val="standardContextual"/>
             </w:rPr>
           </w:pPr>
-          <w:hyperlink w:anchor="_Toc227668216" w:history="1">
+          <w:hyperlink w:anchor="_Toc227677874" w:history="1">
             <w:r>
               <w:rPr>
                 <w:rStyle w:val="Hypertextovodkaz"/>
@@ -3907,7 +4014,7 @@
                 <w:noProof/>
                 <w:webHidden/>
               </w:rPr>
-              <w:instrText xml:space="preserve"> PAGEREF _Toc227668216 \h </w:instrText>
+              <w:instrText xml:space="preserve"> PAGEREF _Toc227677874 \h </w:instrText>
             </w:r>
             <w:r>
               <w:rPr>
@@ -3950,7 +4057,7 @@
               <w14:ligatures w14:val="standardContextual"/>
             </w:rPr>
           </w:pPr>
-          <w:hyperlink w:anchor="_Toc227668217" w:history="1">
+          <w:hyperlink w:anchor="_Toc227677875" w:history="1">
             <w:r>
               <w:rPr>
                 <w:rStyle w:val="Hypertextovodkaz"/>
@@ -3995,7 +4102,95 @@
                 <w:noProof/>
                 <w:webHidden/>
               </w:rPr>
-              <w:instrText xml:space="preserve"> PAGEREF _Toc227668217 \h </w:instrText>
+              <w:instrText xml:space="preserve"> PAGEREF _Toc227677875 \h </w:instrText>
+            </w:r>
+            <w:r>
+              <w:rPr>
+                <w:noProof/>
+                <w:webHidden/>
+              </w:rPr>
+            </w:r>
+            <w:r>
+              <w:rPr>
+                <w:noProof/>
+                <w:webHidden/>
+              </w:rPr>
+              <w:fldChar w:fldCharType="separate"/>
+            </w:r>
+            <w:r>
+              <w:rPr>
+                <w:noProof/>
+                <w:webHidden/>
+              </w:rPr>
+              <w:t>5</w:t>
+            </w:r>
+            <w:r>
+              <w:rPr>
+                <w:noProof/>
+                <w:webHidden/>
+              </w:rPr>
+              <w:fldChar w:fldCharType="end"/>
+            </w:r>
+          </w:hyperlink>
+        </w:p>
+        <w:p>
+          <w:pPr>
+            <w:pStyle w:val="Obsah2"/>
+            <w:rPr>
+              <w:rFonts w:eastAsiaTheme="minorEastAsia"/>
+              <w:noProof/>
+              <w:kern w:val="2"/>
+              <w:szCs w:val="24"/>
+              <w:lang w:eastAsia="cs-CZ"/>
+              <w14:ligatures w14:val="standardContextual"/>
+            </w:rPr>
+          </w:pPr>
+          <w:hyperlink w:anchor="_Toc227677876" w:history="1">
+            <w:r>
+              <w:rPr>
+                <w:rStyle w:val="Hypertextovodkaz"/>
+                <w:noProof/>
+              </w:rPr>
+              <w:t>3.7</w:t>
+            </w:r>
+            <w:r>
+              <w:rPr>
+                <w:rFonts w:eastAsiaTheme="minorEastAsia"/>
+                <w:noProof/>
+                <w:kern w:val="2"/>
+                <w:szCs w:val="24"/>
+                <w:lang w:eastAsia="cs-CZ"/>
+                <w14:ligatures w14:val="standardContextual"/>
+              </w:rPr>
+              <w:tab/>
+            </w:r>
+            <w:r>
+              <w:rPr>
+                <w:rStyle w:val="Hypertextovodkaz"/>
+                <w:noProof/>
+              </w:rPr>
+              <w:t>Endpointy</w:t>
+            </w:r>
+            <w:r>
+              <w:rPr>
+                <w:noProof/>
+                <w:webHidden/>
+              </w:rPr>
+              <w:tab/>
+            </w:r>
+            <w:r>
+              <w:rPr>
+                <w:noProof/>
+                <w:webHidden/>
+              </w:rPr>
+              <w:fldChar w:fldCharType="begin"/>
+            </w:r>
+            <w:r>
+              <w:rPr>
+                <w:noProof/>
+                <w:webHidden/>
+              </w:rPr>
+              <w:instrText xml:space="preserve"> PAGEREF _Toc227677876 \h </w:instrText>
             </w:r>
             <w:r>
               <w:rPr>
@@ -4041,7 +4236,7 @@
               <w14:ligatures w14:val="standardContextual"/>
             </w:rPr>
           </w:pPr>
-          <w:hyperlink w:anchor="_Toc227668218" w:history="1">
+          <w:hyperlink w:anchor="_Toc227677877" w:history="1">
             <w:r>
               <w:rPr>
                 <w:rStyle w:val="Hypertextovodkaz"/>
@@ -4086,7 +4281,7 @@
                 <w:noProof/>
                 <w:webHidden/>
               </w:rPr>
-              <w:instrText xml:space="preserve"> PAGEREF _Toc227668218 \h </w:instrText>
+              <w:instrText xml:space="preserve"> PAGEREF _Toc227677877 \h </w:instrText>
             </w:r>
             <w:r>
               <w:rPr>
@@ -4129,7 +4324,7 @@
               <w14:ligatures w14:val="standardContextual"/>
             </w:rPr>
           </w:pPr>
-          <w:hyperlink w:anchor="_Toc227668219" w:history="1">
+          <w:hyperlink w:anchor="_Toc227677878" w:history="1">
             <w:r>
               <w:rPr>
                 <w:rStyle w:val="Hypertextovodkaz"/>
@@ -4174,7 +4369,7 @@
                 <w:noProof/>
                 <w:webHidden/>
               </w:rPr>
-              <w:instrText xml:space="preserve"> PAGEREF _Toc227668219 \h </w:instrText>
+              <w:instrText xml:space="preserve"> PAGEREF _Toc227677878 \h </w:instrText>
             </w:r>
             <w:r>
               <w:rPr>
@@ -4217,7 +4412,7 @@
               <w14:ligatures w14:val="standardContextual"/>
             </w:rPr>
           </w:pPr>
-          <w:hyperlink w:anchor="_Toc227668220" w:history="1">
+          <w:hyperlink w:anchor="_Toc227677879" w:history="1">
             <w:r>
               <w:rPr>
                 <w:rStyle w:val="Hypertextovodkaz"/>
@@ -4262,7 +4457,7 @@
                 <w:noProof/>
                 <w:webHidden/>
               </w:rPr>
-              <w:instrText xml:space="preserve"> PAGEREF _Toc227668220 \h </w:instrText>
+              <w:instrText xml:space="preserve"> PAGEREF _Toc227677879 \h </w:instrText>
             </w:r>
             <w:r>
               <w:rPr>
@@ -4305,7 +4500,7 @@
               <w14:ligatures w14:val="standardContextual"/>
             </w:rPr>
           </w:pPr>
-          <w:hyperlink w:anchor="_Toc227668221" w:history="1">
+          <w:hyperlink w:anchor="_Toc227677880" w:history="1">
             <w:r>
               <w:rPr>
                 <w:rStyle w:val="Hypertextovodkaz"/>
@@ -4350,7 +4545,7 @@
                 <w:noProof/>
                 <w:webHidden/>
               </w:rPr>
-              <w:instrText xml:space="preserve"> PAGEREF _Toc227668221 \h </w:instrText>
+              <w:instrText xml:space="preserve"> PAGEREF _Toc227677880 \h </w:instrText>
             </w:r>
             <w:r>
               <w:rPr>
@@ -4393,7 +4588,7 @@
               <w14:ligatures w14:val="standardContextual"/>
             </w:rPr>
           </w:pPr>
-          <w:hyperlink w:anchor="_Toc227668222" w:history="1">
+          <w:hyperlink w:anchor="_Toc227677881" w:history="1">
             <w:r>
               <w:rPr>
                 <w:rStyle w:val="Hypertextovodkaz"/>
@@ -4438,7 +4633,7 @@
                 <w:noProof/>
                 <w:webHidden/>
               </w:rPr>
-              <w:instrText xml:space="preserve"> PAGEREF _Toc227668222 \h </w:instrText>
+              <w:instrText xml:space="preserve"> PAGEREF _Toc227677881 \h </w:instrText>
             </w:r>
             <w:r>
               <w:rPr>
@@ -4481,7 +4676,7 @@
               <w14:ligatures w14:val="standardContextual"/>
             </w:rPr>
           </w:pPr>
-          <w:hyperlink w:anchor="_Toc227668223" w:history="1">
+          <w:hyperlink w:anchor="_Toc227677882" w:history="1">
             <w:r>
               <w:rPr>
                 <w:rStyle w:val="Hypertextovodkaz"/>
@@ -4526,7 +4721,7 @@
                 <w:noProof/>
                 <w:webHidden/>
               </w:rPr>
-              <w:instrText xml:space="preserve"> PAGEREF _Toc227668223 \h </w:instrText>
+              <w:instrText xml:space="preserve"> PAGEREF _Toc227677882 \h </w:instrText>
             </w:r>
             <w:r>
               <w:rPr>
@@ -4572,7 +4767,7 @@
               <w14:ligatures w14:val="standardContextual"/>
             </w:rPr>
           </w:pPr>
-          <w:hyperlink w:anchor="_Toc227668224" w:history="1">
+          <w:hyperlink w:anchor="_Toc227677883" w:history="1">
             <w:r>
               <w:rPr>
                 <w:rStyle w:val="Hypertextovodkaz"/>
@@ -4617,7 +4812,7 @@
                 <w:noProof/>
                 <w:webHidden/>
               </w:rPr>
-              <w:instrText xml:space="preserve"> PAGEREF _Toc227668224 \h </w:instrText>
+              <w:instrText xml:space="preserve"> PAGEREF _Toc227677883 \h </w:instrText>
             </w:r>
             <w:r>
               <w:rPr>
@@ -4660,7 +4855,7 @@
               <w14:ligatures w14:val="standardContextual"/>
             </w:rPr>
           </w:pPr>
-          <w:hyperlink w:anchor="_Toc227668225" w:history="1">
+          <w:hyperlink w:anchor="_Toc227677884" w:history="1">
             <w:r>
               <w:rPr>
                 <w:rStyle w:val="Hypertextovodkaz"/>
@@ -4705,183 +4900,7 @@
                 <w:noProof/>
                 <w:webHidden/>
               </w:rPr>
-              <w:instrText xml:space="preserve"> PAGEREF _Toc227668225 \h </w:instrText>
-            </w:r>
-            <w:r>
-              <w:rPr>
-                <w:noProof/>
-                <w:webHidden/>
-              </w:rPr>
-            </w:r>
-            <w:r>
-              <w:rPr>
-                <w:noProof/>
-                <w:webHidden/>
-              </w:rPr>
-              <w:fldChar w:fldCharType="separate"/>
-            </w:r>
-            <w:r>
-              <w:rPr>
-                <w:noProof/>
-                <w:webHidden/>
-              </w:rPr>
-              <w:t>7</w:t>
-            </w:r>
-            <w:r>
-              <w:rPr>
-                <w:noProof/>
-                <w:webHidden/>
-              </w:rPr>
-              <w:fldChar w:fldCharType="end"/>
-            </w:r>
-          </w:hyperlink>
-        </w:p>
-        <w:p>
-          <w:pPr>
-            <w:pStyle w:val="Obsah2"/>
-            <w:rPr>
-              <w:rFonts w:eastAsiaTheme="minorEastAsia"/>
-              <w:noProof/>
-              <w:kern w:val="2"/>
-              <w:szCs w:val="24"/>
-              <w:lang w:eastAsia="cs-CZ"/>
-              <w14:ligatures w14:val="standardContextual"/>
-            </w:rPr>
-          </w:pPr>
-          <w:hyperlink w:anchor="_Toc227668226" w:history="1">
-            <w:r>
-              <w:rPr>
-                <w:rStyle w:val="Hypertextovodkaz"/>
-                <w:noProof/>
-              </w:rPr>
-              <w:t>5.2</w:t>
-            </w:r>
-            <w:r>
-              <w:rPr>
-                <w:rFonts w:eastAsiaTheme="minorEastAsia"/>
-                <w:noProof/>
-                <w:kern w:val="2"/>
-                <w:szCs w:val="24"/>
-                <w:lang w:eastAsia="cs-CZ"/>
-                <w14:ligatures w14:val="standardContextual"/>
-              </w:rPr>
-              <w:tab/>
-            </w:r>
-            <w:r>
-              <w:rPr>
-                <w:rStyle w:val="Hypertextovodkaz"/>
-                <w:noProof/>
-              </w:rPr>
-              <w:t>Motivace a sdílení</w:t>
-            </w:r>
-            <w:r>
-              <w:rPr>
-                <w:noProof/>
-                <w:webHidden/>
-              </w:rPr>
-              <w:tab/>
-            </w:r>
-            <w:r>
-              <w:rPr>
-                <w:noProof/>
-                <w:webHidden/>
-              </w:rPr>
-              <w:fldChar w:fldCharType="begin"/>
-            </w:r>
-            <w:r>
-              <w:rPr>
-                <w:noProof/>
-                <w:webHidden/>
-              </w:rPr>
-              <w:instrText xml:space="preserve"> PAGEREF _Toc227668226 \h </w:instrText>
-            </w:r>
-            <w:r>
-              <w:rPr>
-                <w:noProof/>
-                <w:webHidden/>
-              </w:rPr>
-            </w:r>
-            <w:r>
-              <w:rPr>
-                <w:noProof/>
-                <w:webHidden/>
-              </w:rPr>
-              <w:fldChar w:fldCharType="separate"/>
-            </w:r>
-            <w:r>
-              <w:rPr>
-                <w:noProof/>
-                <w:webHidden/>
-              </w:rPr>
-              <w:t>7</w:t>
-            </w:r>
-            <w:r>
-              <w:rPr>
-                <w:noProof/>
-                <w:webHidden/>
-              </w:rPr>
-              <w:fldChar w:fldCharType="end"/>
-            </w:r>
-          </w:hyperlink>
-        </w:p>
-        <w:p>
-          <w:pPr>
-            <w:pStyle w:val="Obsah2"/>
-            <w:rPr>
-              <w:rFonts w:eastAsiaTheme="minorEastAsia"/>
-              <w:noProof/>
-              <w:kern w:val="2"/>
-              <w:szCs w:val="24"/>
-              <w:lang w:eastAsia="cs-CZ"/>
-              <w14:ligatures w14:val="standardContextual"/>
-            </w:rPr>
-          </w:pPr>
-          <w:hyperlink w:anchor="_Toc227668227" w:history="1">
-            <w:r>
-              <w:rPr>
-                <w:rStyle w:val="Hypertextovodkaz"/>
-                <w:noProof/>
-              </w:rPr>
-              <w:t>5.3</w:t>
-            </w:r>
-            <w:r>
-              <w:rPr>
-                <w:rFonts w:eastAsiaTheme="minorEastAsia"/>
-                <w:noProof/>
-                <w:kern w:val="2"/>
-                <w:szCs w:val="24"/>
-                <w:lang w:eastAsia="cs-CZ"/>
-                <w14:ligatures w14:val="standardContextual"/>
-              </w:rPr>
-              <w:tab/>
-            </w:r>
-            <w:r>
-              <w:rPr>
-                <w:rStyle w:val="Hypertextovodkaz"/>
-                <w:noProof/>
-              </w:rPr>
-              <w:t>Gamifikace</w:t>
-            </w:r>
-            <w:r>
-              <w:rPr>
-                <w:noProof/>
-                <w:webHidden/>
-              </w:rPr>
-              <w:tab/>
-            </w:r>
-            <w:r>
-              <w:rPr>
-                <w:noProof/>
-                <w:webHidden/>
-              </w:rPr>
-              <w:fldChar w:fldCharType="begin"/>
-            </w:r>
-            <w:r>
-              <w:rPr>
-                <w:noProof/>
-                <w:webHidden/>
-              </w:rPr>
-              <w:instrText xml:space="preserve"> PAGEREF _Toc227668227 \h </w:instrText>
+              <w:instrText xml:space="preserve"> PAGEREF _Toc227677884 \h </w:instrText>
             </w:r>
             <w:r>
               <w:rPr>
@@ -4927,7 +4946,7 @@
               <w14:ligatures w14:val="standardContextual"/>
             </w:rPr>
           </w:pPr>
-          <w:hyperlink w:anchor="_Toc227668228" w:history="1">
+          <w:hyperlink w:anchor="_Toc227677885" w:history="1">
             <w:r>
               <w:rPr>
                 <w:rStyle w:val="Hypertextovodkaz"/>
@@ -4972,7 +4991,7 @@
                 <w:noProof/>
                 <w:webHidden/>
               </w:rPr>
-              <w:instrText xml:space="preserve"> PAGEREF _Toc227668228 \h </w:instrText>
+              <w:instrText xml:space="preserve"> PAGEREF _Toc227677885 \h </w:instrText>
             </w:r>
             <w:r>
               <w:rPr>
@@ -5015,7 +5034,7 @@
               <w14:ligatures w14:val="standardContextual"/>
             </w:rPr>
           </w:pPr>
-          <w:hyperlink w:anchor="_Toc227668229" w:history="1">
+          <w:hyperlink w:anchor="_Toc227677886" w:history="1">
             <w:r>
               <w:rPr>
                 <w:rStyle w:val="Hypertextovodkaz"/>
@@ -5060,7 +5079,7 @@
                 <w:noProof/>
                 <w:webHidden/>
               </w:rPr>
-              <w:instrText xml:space="preserve"> PAGEREF _Toc227668229 \h </w:instrText>
+              <w:instrText xml:space="preserve"> PAGEREF _Toc227677886 \h </w:instrText>
             </w:r>
             <w:r>
               <w:rPr>
@@ -5103,7 +5122,7 @@
               <w14:ligatures w14:val="standardContextual"/>
             </w:rPr>
           </w:pPr>
-          <w:hyperlink w:anchor="_Toc227668230" w:history="1">
+          <w:hyperlink w:anchor="_Toc227677887" w:history="1">
             <w:r>
               <w:rPr>
                 <w:rStyle w:val="Hypertextovodkaz"/>
@@ -5148,7 +5167,7 @@
                 <w:noProof/>
                 <w:webHidden/>
               </w:rPr>
-              <w:instrText xml:space="preserve"> PAGEREF _Toc227668230 \h </w:instrText>
+              <w:instrText xml:space="preserve"> PAGEREF _Toc227677887 \h </w:instrText>
             </w:r>
             <w:r>
               <w:rPr>
@@ -5191,7 +5210,7 @@
               <w14:ligatures w14:val="standardContextual"/>
             </w:rPr>
           </w:pPr>
-          <w:hyperlink w:anchor="_Toc227668231" w:history="1">
+          <w:hyperlink w:anchor="_Toc227677888" w:history="1">
             <w:r>
               <w:rPr>
                 <w:rStyle w:val="Hypertextovodkaz"/>
@@ -5236,95 +5255,7 @@
                 <w:noProof/>
                 <w:webHidden/>
               </w:rPr>
-              <w:instrText xml:space="preserve"> PAGEREF _Toc227668231 \h </w:instrText>
-            </w:r>
-            <w:r>
-              <w:rPr>
-                <w:noProof/>
-                <w:webHidden/>
-              </w:rPr>
-            </w:r>
-            <w:r>
-              <w:rPr>
-                <w:noProof/>
-                <w:webHidden/>
-              </w:rPr>
-              <w:fldChar w:fldCharType="separate"/>
-            </w:r>
-            <w:r>
-              <w:rPr>
-                <w:noProof/>
-                <w:webHidden/>
-              </w:rPr>
-              <w:t>8</w:t>
-            </w:r>
-            <w:r>
-              <w:rPr>
-                <w:noProof/>
-                <w:webHidden/>
-              </w:rPr>
-              <w:fldChar w:fldCharType="end"/>
-            </w:r>
-          </w:hyperlink>
-        </w:p>
-        <w:p>
-          <w:pPr>
-            <w:pStyle w:val="Obsah2"/>
-            <w:rPr>
-              <w:rFonts w:eastAsiaTheme="minorEastAsia"/>
-              <w:noProof/>
-              <w:kern w:val="2"/>
-              <w:szCs w:val="24"/>
-              <w:lang w:eastAsia="cs-CZ"/>
-              <w14:ligatures w14:val="standardContextual"/>
-            </w:rPr>
-          </w:pPr>
-          <w:hyperlink w:anchor="_Toc227668232" w:history="1">
-            <w:r>
-              <w:rPr>
-                <w:rStyle w:val="Hypertextovodkaz"/>
-                <w:noProof/>
-              </w:rPr>
-              <w:t>6.4</w:t>
-            </w:r>
-            <w:r>
-              <w:rPr>
-                <w:rFonts w:eastAsiaTheme="minorEastAsia"/>
-                <w:noProof/>
-                <w:kern w:val="2"/>
-                <w:szCs w:val="24"/>
-                <w:lang w:eastAsia="cs-CZ"/>
-                <w14:ligatures w14:val="standardContextual"/>
-              </w:rPr>
-              <w:tab/>
-            </w:r>
-            <w:r>
-              <w:rPr>
-                <w:rStyle w:val="Hypertextovodkaz"/>
-                <w:noProof/>
-              </w:rPr>
-              <w:t>Distribuce přes Apple a Google</w:t>
-            </w:r>
-            <w:r>
-              <w:rPr>
-                <w:noProof/>
-                <w:webHidden/>
-              </w:rPr>
-              <w:tab/>
-            </w:r>
-            <w:r>
-              <w:rPr>
-                <w:noProof/>
-                <w:webHidden/>
-              </w:rPr>
-              <w:fldChar w:fldCharType="begin"/>
-            </w:r>
-            <w:r>
-              <w:rPr>
-                <w:noProof/>
-                <w:webHidden/>
-              </w:rPr>
-              <w:instrText xml:space="preserve"> PAGEREF _Toc227668232 \h </w:instrText>
+              <w:instrText xml:space="preserve"> PAGEREF _Toc227677888 \h </w:instrText>
             </w:r>
             <w:r>
               <w:rPr>
@@ -5370,7 +5301,7 @@
               <w14:ligatures w14:val="standardContextual"/>
             </w:rPr>
           </w:pPr>
-          <w:hyperlink w:anchor="_Toc227668233" w:history="1">
+          <w:hyperlink w:anchor="_Toc227677889" w:history="1">
             <w:r>
               <w:rPr>
                 <w:rStyle w:val="Hypertextovodkaz"/>
@@ -5415,7 +5346,7 @@
                 <w:noProof/>
                 <w:webHidden/>
               </w:rPr>
-              <w:instrText xml:space="preserve"> PAGEREF _Toc227668233 \h </w:instrText>
+              <w:instrText xml:space="preserve"> PAGEREF _Toc227677889 \h </w:instrText>
             </w:r>
             <w:r>
               <w:rPr>
@@ -5458,7 +5389,7 @@
               <w14:ligatures w14:val="standardContextual"/>
             </w:rPr>
           </w:pPr>
-          <w:hyperlink w:anchor="_Toc227668234" w:history="1">
+          <w:hyperlink w:anchor="_Toc227677890" w:history="1">
             <w:r>
               <w:rPr>
                 <w:rStyle w:val="Hypertextovodkaz"/>
@@ -5503,7 +5434,7 @@
                 <w:noProof/>
                 <w:webHidden/>
               </w:rPr>
-              <w:instrText xml:space="preserve"> PAGEREF _Toc227668234 \h </w:instrText>
+              <w:instrText xml:space="preserve"> PAGEREF _Toc227677890 \h </w:instrText>
             </w:r>
             <w:r>
               <w:rPr>
@@ -5546,7 +5477,7 @@
               <w14:ligatures w14:val="standardContextual"/>
             </w:rPr>
           </w:pPr>
-          <w:hyperlink w:anchor="_Toc227668235" w:history="1">
+          <w:hyperlink w:anchor="_Toc227677891" w:history="1">
             <w:r>
               <w:rPr>
                 <w:rStyle w:val="Hypertextovodkaz"/>
@@ -5591,7 +5522,7 @@
                 <w:noProof/>
                 <w:webHidden/>
               </w:rPr>
-              <w:instrText xml:space="preserve"> PAGEREF _Toc227668235 \h </w:instrText>
+              <w:instrText xml:space="preserve"> PAGEREF _Toc227677891 \h </w:instrText>
             </w:r>
             <w:r>
               <w:rPr>
@@ -5612,374 +5543,6 @@
                 <w:webHidden/>
               </w:rPr>
               <w:t>9</w:t>
-            </w:r>
-            <w:r>
-              <w:rPr>
-                <w:noProof/>
-                <w:webHidden/>
-              </w:rPr>
-              <w:fldChar w:fldCharType="end"/>
-            </w:r>
-          </w:hyperlink>
-        </w:p>
-        <w:p>
-          <w:pPr>
-            <w:pStyle w:val="Obsah2"/>
-            <w:rPr>
-              <w:rFonts w:eastAsiaTheme="minorEastAsia"/>
-              <w:noProof/>
-              <w:kern w:val="2"/>
-              <w:szCs w:val="24"/>
-              <w:lang w:eastAsia="cs-CZ"/>
-              <w14:ligatures w14:val="standardContextual"/>
-            </w:rPr>
-          </w:pPr>
-          <w:hyperlink w:anchor="_Toc227668236" w:history="1">
-            <w:r>
-              <w:rPr>
-                <w:rStyle w:val="Hypertextovodkaz"/>
-                <w:noProof/>
-              </w:rPr>
-              <w:t>7.3</w:t>
-            </w:r>
-            <w:r>
-              <w:rPr>
-                <w:rFonts w:eastAsiaTheme="minorEastAsia"/>
-                <w:noProof/>
-                <w:kern w:val="2"/>
-                <w:szCs w:val="24"/>
-                <w:lang w:eastAsia="cs-CZ"/>
-                <w14:ligatures w14:val="standardContextual"/>
-              </w:rPr>
-              <w:tab/>
-            </w:r>
-            <w:r>
-              <w:rPr>
-                <w:rStyle w:val="Hypertextovodkaz"/>
-                <w:noProof/>
-              </w:rPr>
-              <w:t>API Management</w:t>
-            </w:r>
-            <w:r>
-              <w:rPr>
-                <w:noProof/>
-                <w:webHidden/>
-              </w:rPr>
-              <w:tab/>
-            </w:r>
-            <w:r>
-              <w:rPr>
-                <w:noProof/>
-                <w:webHidden/>
-              </w:rPr>
-              <w:fldChar w:fldCharType="begin"/>
-            </w:r>
-            <w:r>
-              <w:rPr>
-                <w:noProof/>
-                <w:webHidden/>
-              </w:rPr>
-              <w:instrText xml:space="preserve"> PAGEREF _Toc227668236 \h </w:instrText>
-            </w:r>
-            <w:r>
-              <w:rPr>
-                <w:noProof/>
-                <w:webHidden/>
-              </w:rPr>
-            </w:r>
-            <w:r>
-              <w:rPr>
-                <w:noProof/>
-                <w:webHidden/>
-              </w:rPr>
-              <w:fldChar w:fldCharType="separate"/>
-            </w:r>
-            <w:r>
-              <w:rPr>
-                <w:noProof/>
-                <w:webHidden/>
-              </w:rPr>
-              <w:t>9</w:t>
-            </w:r>
-            <w:r>
-              <w:rPr>
-                <w:noProof/>
-                <w:webHidden/>
-              </w:rPr>
-              <w:fldChar w:fldCharType="end"/>
-            </w:r>
-          </w:hyperlink>
-        </w:p>
-        <w:p>
-          <w:pPr>
-            <w:pStyle w:val="Obsah1"/>
-            <w:rPr>
-              <w:rFonts w:eastAsiaTheme="minorEastAsia"/>
-              <w:noProof/>
-              <w:kern w:val="2"/>
-              <w:szCs w:val="24"/>
-              <w:lang w:eastAsia="cs-CZ"/>
-              <w14:ligatures w14:val="standardContextual"/>
-            </w:rPr>
-          </w:pPr>
-          <w:hyperlink w:anchor="_Toc227668237" w:history="1">
-            <w:r>
-              <w:rPr>
-                <w:rStyle w:val="Hypertextovodkaz"/>
-                <w:noProof/>
-              </w:rPr>
-              <w:t>Závěr</w:t>
-            </w:r>
-            <w:r>
-              <w:rPr>
-                <w:noProof/>
-                <w:webHidden/>
-              </w:rPr>
-              <w:tab/>
-            </w:r>
-            <w:r>
-              <w:rPr>
-                <w:noProof/>
-                <w:webHidden/>
-              </w:rPr>
-              <w:fldChar w:fldCharType="begin"/>
-            </w:r>
-            <w:r>
-              <w:rPr>
-                <w:noProof/>
-                <w:webHidden/>
-              </w:rPr>
-              <w:instrText xml:space="preserve"> PAGEREF _Toc227668237 \h </w:instrText>
-            </w:r>
-            <w:r>
-              <w:rPr>
-                <w:noProof/>
-                <w:webHidden/>
-              </w:rPr>
-            </w:r>
-            <w:r>
-              <w:rPr>
-                <w:noProof/>
-                <w:webHidden/>
-              </w:rPr>
-              <w:fldChar w:fldCharType="separate"/>
-            </w:r>
-            <w:r>
-              <w:rPr>
-                <w:noProof/>
-                <w:webHidden/>
-              </w:rPr>
-              <w:t>10</w:t>
-            </w:r>
-            <w:r>
-              <w:rPr>
-                <w:noProof/>
-                <w:webHidden/>
-              </w:rPr>
-              <w:fldChar w:fldCharType="end"/>
-            </w:r>
-          </w:hyperlink>
-        </w:p>
-        <w:p>
-          <w:pPr>
-            <w:pStyle w:val="Obsah1"/>
-            <w:rPr>
-              <w:rFonts w:eastAsiaTheme="minorEastAsia"/>
-              <w:noProof/>
-              <w:kern w:val="2"/>
-              <w:szCs w:val="24"/>
-              <w:lang w:eastAsia="cs-CZ"/>
-              <w14:ligatures w14:val="standardContextual"/>
-            </w:rPr>
-          </w:pPr>
-          <w:hyperlink w:anchor="_Toc227668238" w:history="1">
-            <w:r>
-              <w:rPr>
-                <w:rStyle w:val="Hypertextovodkaz"/>
-                <w:noProof/>
-              </w:rPr>
-              <w:t>Seznam zkratek a odborných výrazů</w:t>
-            </w:r>
-            <w:r>
-              <w:rPr>
-                <w:noProof/>
-                <w:webHidden/>
-              </w:rPr>
-              <w:tab/>
-            </w:r>
-            <w:r>
-              <w:rPr>
-                <w:noProof/>
-                <w:webHidden/>
-              </w:rPr>
-              <w:fldChar w:fldCharType="begin"/>
-            </w:r>
-            <w:r>
-              <w:rPr>
-                <w:noProof/>
-                <w:webHidden/>
-              </w:rPr>
-              <w:instrText xml:space="preserve"> PAGEREF _Toc227668238 \h </w:instrText>
-            </w:r>
-            <w:r>
-              <w:rPr>
-                <w:noProof/>
-                <w:webHidden/>
-              </w:rPr>
-            </w:r>
-            <w:r>
-              <w:rPr>
-                <w:noProof/>
-                <w:webHidden/>
-              </w:rPr>
-              <w:fldChar w:fldCharType="separate"/>
-            </w:r>
-            <w:r>
-              <w:rPr>
-                <w:noProof/>
-                <w:webHidden/>
-              </w:rPr>
-              <w:t>11</w:t>
-            </w:r>
-            <w:r>
-              <w:rPr>
-                <w:noProof/>
-                <w:webHidden/>
-              </w:rPr>
-              <w:fldChar w:fldCharType="end"/>
-            </w:r>
-          </w:hyperlink>
-        </w:p>
-        <w:p>
-          <w:pPr>
-            <w:pStyle w:val="Obsah1"/>
-            <w:rPr>
-              <w:rFonts w:eastAsiaTheme="minorEastAsia"/>
-              <w:noProof/>
-              <w:kern w:val="2"/>
-              <w:szCs w:val="24"/>
-              <w:lang w:eastAsia="cs-CZ"/>
-              <w14:ligatures w14:val="standardContextual"/>
-            </w:rPr>
-          </w:pPr>
-          <w:hyperlink w:anchor="_Toc227668239" w:history="1">
-            <w:r>
-              <w:rPr>
-                <w:rStyle w:val="Hypertextovodkaz"/>
-                <w:noProof/>
-              </w:rPr>
-              <w:t>Seznam obrázků</w:t>
-            </w:r>
-            <w:r>
-              <w:rPr>
-                <w:noProof/>
-                <w:webHidden/>
-              </w:rPr>
-              <w:tab/>
-            </w:r>
-            <w:r>
-              <w:rPr>
-                <w:noProof/>
-                <w:webHidden/>
-              </w:rPr>
-              <w:fldChar w:fldCharType="begin"/>
-            </w:r>
-            <w:r>
-              <w:rPr>
-                <w:noProof/>
-                <w:webHidden/>
-              </w:rPr>
-              <w:instrText xml:space="preserve"> PAGEREF _Toc227668239 \h </w:instrText>
-            </w:r>
-            <w:r>
-              <w:rPr>
-                <w:noProof/>
-                <w:webHidden/>
-              </w:rPr>
-            </w:r>
-            <w:r>
-              <w:rPr>
-                <w:noProof/>
-                <w:webHidden/>
-              </w:rPr>
-              <w:fldChar w:fldCharType="separate"/>
-            </w:r>
-            <w:r>
-              <w:rPr>
-                <w:noProof/>
-                <w:webHidden/>
-              </w:rPr>
-              <w:t>12</w:t>
-            </w:r>
-            <w:r>
-              <w:rPr>
-                <w:noProof/>
-                <w:webHidden/>
-              </w:rPr>
-              <w:fldChar w:fldCharType="end"/>
-            </w:r>
-          </w:hyperlink>
-        </w:p>
-        <w:p>
-          <w:pPr>
-            <w:pStyle w:val="Obsah1"/>
-            <w:rPr>
-              <w:rFonts w:eastAsiaTheme="minorEastAsia"/>
-              <w:noProof/>
-              <w:kern w:val="2"/>
-              <w:szCs w:val="24"/>
-              <w:lang w:eastAsia="cs-CZ"/>
-              <w14:ligatures w14:val="standardContextual"/>
-            </w:rPr>
-          </w:pPr>
-          <w:hyperlink w:anchor="_Toc227668240" w:history="1">
-            <w:r>
-              <w:rPr>
-                <w:rStyle w:val="Hypertextovodkaz"/>
-                <w:noProof/>
-              </w:rPr>
-              <w:t>Použité zdroje</w:t>
-            </w:r>
-            <w:r>
-              <w:rPr>
-                <w:noProof/>
-                <w:webHidden/>
-              </w:rPr>
-              <w:tab/>
-            </w:r>
-            <w:r>
-              <w:rPr>
-                <w:noProof/>
-                <w:webHidden/>
-              </w:rPr>
-              <w:fldChar w:fldCharType="begin"/>
-            </w:r>
-            <w:r>
-              <w:rPr>
-                <w:noProof/>
-                <w:webHidden/>
-              </w:rPr>
-              <w:instrText xml:space="preserve"> PAGEREF _Toc227668240 \h </w:instrText>
-            </w:r>
-            <w:r>
-              <w:rPr>
-                <w:noProof/>
-                <w:webHidden/>
-              </w:rPr>
-            </w:r>
-            <w:r>
-              <w:rPr>
-                <w:noProof/>
-                <w:webHidden/>
-              </w:rPr>
-              <w:fldChar w:fldCharType="separate"/>
-            </w:r>
-            <w:r>
-              <w:rPr>
-                <w:noProof/>
-                <w:webHidden/>
-              </w:rPr>
-              <w:t>13</w:t>
             </w:r>
             <w:r>
               <w:rPr>
@@ -6005,13 +5568,13 @@
               <w14:ligatures w14:val="standardContextual"/>
             </w:rPr>
           </w:pPr>
-          <w:hyperlink w:anchor="_Toc227668241" w:history="1">
+          <w:hyperlink w:anchor="_Toc227677892" w:history="1">
             <w:r>
               <w:rPr>
                 <w:rStyle w:val="Hypertextovodkaz"/>
                 <w:noProof/>
               </w:rPr>
-              <w:t>A.</w:t>
+              <w:t>8</w:t>
             </w:r>
             <w:r>
               <w:rPr>
@@ -6029,6 +5592,741 @@
                 <w:rStyle w:val="Hypertextovodkaz"/>
                 <w:noProof/>
               </w:rPr>
+              <w:t>Testování aplikace</w:t>
+            </w:r>
+            <w:r>
+              <w:rPr>
+                <w:noProof/>
+                <w:webHidden/>
+              </w:rPr>
+              <w:tab/>
+            </w:r>
+            <w:r>
+              <w:rPr>
+                <w:noProof/>
+                <w:webHidden/>
+              </w:rPr>
+              <w:fldChar w:fldCharType="begin"/>
+            </w:r>
+            <w:r>
+              <w:rPr>
+                <w:noProof/>
+                <w:webHidden/>
+              </w:rPr>
+              <w:instrText xml:space="preserve"> PAGEREF _Toc227677892 \h </w:instrText>
+            </w:r>
+            <w:r>
+              <w:rPr>
+                <w:noProof/>
+                <w:webHidden/>
+              </w:rPr>
+            </w:r>
+            <w:r>
+              <w:rPr>
+                <w:noProof/>
+                <w:webHidden/>
+              </w:rPr>
+              <w:fldChar w:fldCharType="separate"/>
+            </w:r>
+            <w:r>
+              <w:rPr>
+                <w:noProof/>
+                <w:webHidden/>
+              </w:rPr>
+              <w:t>10</w:t>
+            </w:r>
+            <w:r>
+              <w:rPr>
+                <w:noProof/>
+                <w:webHidden/>
+              </w:rPr>
+              <w:fldChar w:fldCharType="end"/>
+            </w:r>
+          </w:hyperlink>
+        </w:p>
+        <w:p>
+          <w:pPr>
+            <w:pStyle w:val="Obsah1"/>
+            <w:tabs>
+              <w:tab w:val="left" w:pos="720"/>
+            </w:tabs>
+            <w:rPr>
+              <w:rFonts w:eastAsiaTheme="minorEastAsia"/>
+              <w:noProof/>
+              <w:kern w:val="2"/>
+              <w:szCs w:val="24"/>
+              <w:lang w:eastAsia="cs-CZ"/>
+              <w14:ligatures w14:val="standardContextual"/>
+            </w:rPr>
+          </w:pPr>
+          <w:hyperlink w:anchor="_Toc227677893" w:history="1">
+            <w:r>
+              <w:rPr>
+                <w:rStyle w:val="Hypertextovodkaz"/>
+                <w:noProof/>
+              </w:rPr>
+              <w:t>9</w:t>
+            </w:r>
+            <w:r>
+              <w:rPr>
+                <w:rFonts w:eastAsiaTheme="minorEastAsia"/>
+                <w:noProof/>
+                <w:kern w:val="2"/>
+                <w:szCs w:val="24"/>
+                <w:lang w:eastAsia="cs-CZ"/>
+                <w14:ligatures w14:val="standardContextual"/>
+              </w:rPr>
+              <w:tab/>
+            </w:r>
+            <w:r>
+              <w:rPr>
+                <w:rStyle w:val="Hypertextovodkaz"/>
+                <w:noProof/>
+              </w:rPr>
+              <w:t>Nasazení PostHog analytic</w:t>
+            </w:r>
+            <w:r>
+              <w:rPr>
+                <w:noProof/>
+                <w:webHidden/>
+              </w:rPr>
+              <w:tab/>
+            </w:r>
+            <w:r>
+              <w:rPr>
+                <w:noProof/>
+                <w:webHidden/>
+              </w:rPr>
+              <w:fldChar w:fldCharType="begin"/>
+            </w:r>
+            <w:r>
+              <w:rPr>
+                <w:noProof/>
+                <w:webHidden/>
+              </w:rPr>
+              <w:instrText xml:space="preserve"> PAGEREF _Toc227677893 \h </w:instrText>
+            </w:r>
+            <w:r>
+              <w:rPr>
+                <w:noProof/>
+                <w:webHidden/>
+              </w:rPr>
+            </w:r>
+            <w:r>
+              <w:rPr>
+                <w:noProof/>
+                <w:webHidden/>
+              </w:rPr>
+              <w:fldChar w:fldCharType="separate"/>
+            </w:r>
+            <w:r>
+              <w:rPr>
+                <w:noProof/>
+                <w:webHidden/>
+              </w:rPr>
+              <w:t>11</w:t>
+            </w:r>
+            <w:r>
+              <w:rPr>
+                <w:noProof/>
+                <w:webHidden/>
+              </w:rPr>
+              <w:fldChar w:fldCharType="end"/>
+            </w:r>
+          </w:hyperlink>
+        </w:p>
+        <w:p>
+          <w:pPr>
+            <w:pStyle w:val="Obsah1"/>
+            <w:tabs>
+              <w:tab w:val="left" w:pos="720"/>
+            </w:tabs>
+            <w:rPr>
+              <w:rFonts w:eastAsiaTheme="minorEastAsia"/>
+              <w:noProof/>
+              <w:kern w:val="2"/>
+              <w:szCs w:val="24"/>
+              <w:lang w:eastAsia="cs-CZ"/>
+              <w14:ligatures w14:val="standardContextual"/>
+            </w:rPr>
+          </w:pPr>
+          <w:hyperlink w:anchor="_Toc227677894" w:history="1">
+            <w:r>
+              <w:rPr>
+                <w:rStyle w:val="Hypertextovodkaz"/>
+                <w:noProof/>
+              </w:rPr>
+              <w:t>10</w:t>
+            </w:r>
+            <w:r>
+              <w:rPr>
+                <w:rFonts w:eastAsiaTheme="minorEastAsia"/>
+                <w:noProof/>
+                <w:kern w:val="2"/>
+                <w:szCs w:val="24"/>
+                <w:lang w:eastAsia="cs-CZ"/>
+                <w14:ligatures w14:val="standardContextual"/>
+              </w:rPr>
+              <w:tab/>
+            </w:r>
+            <w:r>
+              <w:rPr>
+                <w:rStyle w:val="Hypertextovodkaz"/>
+                <w:noProof/>
+              </w:rPr>
+              <w:t>Testování s uživateli</w:t>
+            </w:r>
+            <w:r>
+              <w:rPr>
+                <w:noProof/>
+                <w:webHidden/>
+              </w:rPr>
+              <w:tab/>
+            </w:r>
+            <w:r>
+              <w:rPr>
+                <w:noProof/>
+                <w:webHidden/>
+              </w:rPr>
+              <w:fldChar w:fldCharType="begin"/>
+            </w:r>
+            <w:r>
+              <w:rPr>
+                <w:noProof/>
+                <w:webHidden/>
+              </w:rPr>
+              <w:instrText xml:space="preserve"> PAGEREF _Toc227677894 \h </w:instrText>
+            </w:r>
+            <w:r>
+              <w:rPr>
+                <w:noProof/>
+                <w:webHidden/>
+              </w:rPr>
+            </w:r>
+            <w:r>
+              <w:rPr>
+                <w:noProof/>
+                <w:webHidden/>
+              </w:rPr>
+              <w:fldChar w:fldCharType="separate"/>
+            </w:r>
+            <w:r>
+              <w:rPr>
+                <w:noProof/>
+                <w:webHidden/>
+              </w:rPr>
+              <w:t>12</w:t>
+            </w:r>
+            <w:r>
+              <w:rPr>
+                <w:noProof/>
+                <w:webHidden/>
+              </w:rPr>
+              <w:fldChar w:fldCharType="end"/>
+            </w:r>
+          </w:hyperlink>
+        </w:p>
+        <w:p>
+          <w:pPr>
+            <w:pStyle w:val="Obsah1"/>
+            <w:tabs>
+              <w:tab w:val="left" w:pos="720"/>
+            </w:tabs>
+            <w:rPr>
+              <w:rFonts w:eastAsiaTheme="minorEastAsia"/>
+              <w:noProof/>
+              <w:kern w:val="2"/>
+              <w:szCs w:val="24"/>
+              <w:lang w:eastAsia="cs-CZ"/>
+              <w14:ligatures w14:val="standardContextual"/>
+            </w:rPr>
+          </w:pPr>
+          <w:hyperlink w:anchor="_Toc227677895" w:history="1">
+            <w:r>
+              <w:rPr>
+                <w:rStyle w:val="Hypertextovodkaz"/>
+                <w:noProof/>
+              </w:rPr>
+              <w:t>11</w:t>
+            </w:r>
+            <w:r>
+              <w:rPr>
+                <w:rFonts w:eastAsiaTheme="minorEastAsia"/>
+                <w:noProof/>
+                <w:kern w:val="2"/>
+                <w:szCs w:val="24"/>
+                <w:lang w:eastAsia="cs-CZ"/>
+                <w14:ligatures w14:val="standardContextual"/>
+              </w:rPr>
+              <w:tab/>
+            </w:r>
+            <w:r>
+              <w:rPr>
+                <w:rStyle w:val="Hypertextovodkaz"/>
+                <w:noProof/>
+              </w:rPr>
+              <w:t>Optimalizace aplikace z pohledu UX</w:t>
+            </w:r>
+            <w:r>
+              <w:rPr>
+                <w:noProof/>
+                <w:webHidden/>
+              </w:rPr>
+              <w:tab/>
+            </w:r>
+            <w:r>
+              <w:rPr>
+                <w:noProof/>
+                <w:webHidden/>
+              </w:rPr>
+              <w:fldChar w:fldCharType="begin"/>
+            </w:r>
+            <w:r>
+              <w:rPr>
+                <w:noProof/>
+                <w:webHidden/>
+              </w:rPr>
+              <w:instrText xml:space="preserve"> PAGEREF _Toc227677895 \h </w:instrText>
+            </w:r>
+            <w:r>
+              <w:rPr>
+                <w:noProof/>
+                <w:webHidden/>
+              </w:rPr>
+            </w:r>
+            <w:r>
+              <w:rPr>
+                <w:noProof/>
+                <w:webHidden/>
+              </w:rPr>
+              <w:fldChar w:fldCharType="separate"/>
+            </w:r>
+            <w:r>
+              <w:rPr>
+                <w:noProof/>
+                <w:webHidden/>
+              </w:rPr>
+              <w:t>13</w:t>
+            </w:r>
+            <w:r>
+              <w:rPr>
+                <w:noProof/>
+                <w:webHidden/>
+              </w:rPr>
+              <w:fldChar w:fldCharType="end"/>
+            </w:r>
+          </w:hyperlink>
+        </w:p>
+        <w:p>
+          <w:pPr>
+            <w:pStyle w:val="Obsah1"/>
+            <w:tabs>
+              <w:tab w:val="left" w:pos="720"/>
+            </w:tabs>
+            <w:rPr>
+              <w:rFonts w:eastAsiaTheme="minorEastAsia"/>
+              <w:noProof/>
+              <w:kern w:val="2"/>
+              <w:szCs w:val="24"/>
+              <w:lang w:eastAsia="cs-CZ"/>
+              <w14:ligatures w14:val="standardContextual"/>
+            </w:rPr>
+          </w:pPr>
+          <w:hyperlink w:anchor="_Toc227677896" w:history="1">
+            <w:r>
+              <w:rPr>
+                <w:rStyle w:val="Hypertextovodkaz"/>
+                <w:noProof/>
+              </w:rPr>
+              <w:t>12</w:t>
+            </w:r>
+            <w:r>
+              <w:rPr>
+                <w:rFonts w:eastAsiaTheme="minorEastAsia"/>
+                <w:noProof/>
+                <w:kern w:val="2"/>
+                <w:szCs w:val="24"/>
+                <w:lang w:eastAsia="cs-CZ"/>
+                <w14:ligatures w14:val="standardContextual"/>
+              </w:rPr>
+              <w:tab/>
+            </w:r>
+            <w:r>
+              <w:rPr>
+                <w:rStyle w:val="Hypertextovodkaz"/>
+                <w:noProof/>
+              </w:rPr>
+              <w:t>Využití AI v projektu</w:t>
+            </w:r>
+            <w:r>
+              <w:rPr>
+                <w:noProof/>
+                <w:webHidden/>
+              </w:rPr>
+              <w:tab/>
+            </w:r>
+            <w:r>
+              <w:rPr>
+                <w:noProof/>
+                <w:webHidden/>
+              </w:rPr>
+              <w:fldChar w:fldCharType="begin"/>
+            </w:r>
+            <w:r>
+              <w:rPr>
+                <w:noProof/>
+                <w:webHidden/>
+              </w:rPr>
+              <w:instrText xml:space="preserve"> PAGEREF _Toc227677896 \h </w:instrText>
+            </w:r>
+            <w:r>
+              <w:rPr>
+                <w:noProof/>
+                <w:webHidden/>
+              </w:rPr>
+            </w:r>
+            <w:r>
+              <w:rPr>
+                <w:noProof/>
+                <w:webHidden/>
+              </w:rPr>
+              <w:fldChar w:fldCharType="separate"/>
+            </w:r>
+            <w:r>
+              <w:rPr>
+                <w:noProof/>
+                <w:webHidden/>
+              </w:rPr>
+              <w:t>14</w:t>
+            </w:r>
+            <w:r>
+              <w:rPr>
+                <w:noProof/>
+                <w:webHidden/>
+              </w:rPr>
+              <w:fldChar w:fldCharType="end"/>
+            </w:r>
+          </w:hyperlink>
+        </w:p>
+        <w:p>
+          <w:pPr>
+            <w:pStyle w:val="Obsah1"/>
+            <w:rPr>
+              <w:rFonts w:eastAsiaTheme="minorEastAsia"/>
+              <w:noProof/>
+              <w:kern w:val="2"/>
+              <w:szCs w:val="24"/>
+              <w:lang w:eastAsia="cs-CZ"/>
+              <w14:ligatures w14:val="standardContextual"/>
+            </w:rPr>
+          </w:pPr>
+          <w:hyperlink w:anchor="_Toc227677897" w:history="1">
+            <w:r>
+              <w:rPr>
+                <w:rStyle w:val="Hypertextovodkaz"/>
+                <w:noProof/>
+              </w:rPr>
+              <w:t>Závěr</w:t>
+            </w:r>
+            <w:r>
+              <w:rPr>
+                <w:noProof/>
+                <w:webHidden/>
+              </w:rPr>
+              <w:tab/>
+            </w:r>
+            <w:r>
+              <w:rPr>
+                <w:noProof/>
+                <w:webHidden/>
+              </w:rPr>
+              <w:fldChar w:fldCharType="begin"/>
+            </w:r>
+            <w:r>
+              <w:rPr>
+                <w:noProof/>
+                <w:webHidden/>
+              </w:rPr>
+              <w:instrText xml:space="preserve"> PAGEREF _Toc227677897 \h </w:instrText>
+            </w:r>
+            <w:r>
+              <w:rPr>
+                <w:noProof/>
+                <w:webHidden/>
+              </w:rPr>
+            </w:r>
+            <w:r>
+              <w:rPr>
+                <w:noProof/>
+                <w:webHidden/>
+              </w:rPr>
+              <w:fldChar w:fldCharType="separate"/>
+            </w:r>
+            <w:r>
+              <w:rPr>
+                <w:noProof/>
+                <w:webHidden/>
+              </w:rPr>
+              <w:t>15</w:t>
+            </w:r>
+            <w:r>
+              <w:rPr>
+                <w:noProof/>
+                <w:webHidden/>
+              </w:rPr>
+              <w:fldChar w:fldCharType="end"/>
+            </w:r>
+          </w:hyperlink>
+        </w:p>
+        <w:p>
+          <w:pPr>
+            <w:pStyle w:val="Obsah1"/>
+            <w:rPr>
+              <w:rFonts w:eastAsiaTheme="minorEastAsia"/>
+              <w:noProof/>
+              <w:kern w:val="2"/>
+              <w:szCs w:val="24"/>
+              <w:lang w:eastAsia="cs-CZ"/>
+              <w14:ligatures w14:val="standardContextual"/>
+            </w:rPr>
+          </w:pPr>
+          <w:hyperlink w:anchor="_Toc227677898" w:history="1">
+            <w:r>
+              <w:rPr>
+                <w:rStyle w:val="Hypertextovodkaz"/>
+                <w:noProof/>
+              </w:rPr>
+              <w:t>Seznam zkratek a odborných výrazů</w:t>
+            </w:r>
+            <w:r>
+              <w:rPr>
+                <w:noProof/>
+                <w:webHidden/>
+              </w:rPr>
+              <w:tab/>
+            </w:r>
+            <w:r>
+              <w:rPr>
+                <w:noProof/>
+                <w:webHidden/>
+              </w:rPr>
+              <w:fldChar w:fldCharType="begin"/>
+            </w:r>
+            <w:r>
+              <w:rPr>
+                <w:noProof/>
+                <w:webHidden/>
+              </w:rPr>
+              <w:instrText xml:space="preserve"> PAGEREF _Toc227677898 \h </w:instrText>
+            </w:r>
+            <w:r>
+              <w:rPr>
+                <w:noProof/>
+                <w:webHidden/>
+              </w:rPr>
+            </w:r>
+            <w:r>
+              <w:rPr>
+                <w:noProof/>
+                <w:webHidden/>
+              </w:rPr>
+              <w:fldChar w:fldCharType="separate"/>
+            </w:r>
+            <w:r>
+              <w:rPr>
+                <w:noProof/>
+                <w:webHidden/>
+              </w:rPr>
+              <w:t>16</w:t>
+            </w:r>
+            <w:r>
+              <w:rPr>
+                <w:noProof/>
+                <w:webHidden/>
+              </w:rPr>
+              <w:fldChar w:fldCharType="end"/>
+            </w:r>
+          </w:hyperlink>
+        </w:p>
+        <w:p>
+          <w:pPr>
+            <w:pStyle w:val="Obsah1"/>
+            <w:rPr>
+              <w:rFonts w:eastAsiaTheme="minorEastAsia"/>
+              <w:noProof/>
+              <w:kern w:val="2"/>
+              <w:szCs w:val="24"/>
+              <w:lang w:eastAsia="cs-CZ"/>
+              <w14:ligatures w14:val="standardContextual"/>
+            </w:rPr>
+          </w:pPr>
+          <w:hyperlink w:anchor="_Toc227677899" w:history="1">
+            <w:r>
+              <w:rPr>
+                <w:rStyle w:val="Hypertextovodkaz"/>
+                <w:noProof/>
+              </w:rPr>
+              <w:t>Seznam obrázků</w:t>
+            </w:r>
+            <w:r>
+              <w:rPr>
+                <w:noProof/>
+                <w:webHidden/>
+              </w:rPr>
+              <w:tab/>
+            </w:r>
+            <w:r>
+              <w:rPr>
+                <w:noProof/>
+                <w:webHidden/>
+              </w:rPr>
+              <w:fldChar w:fldCharType="begin"/>
+            </w:r>
+            <w:r>
+              <w:rPr>
+                <w:noProof/>
+                <w:webHidden/>
+              </w:rPr>
+              <w:instrText xml:space="preserve"> PAGEREF _Toc227677899 \h </w:instrText>
+            </w:r>
+            <w:r>
+              <w:rPr>
+                <w:noProof/>
+                <w:webHidden/>
+              </w:rPr>
+            </w:r>
+            <w:r>
+              <w:rPr>
+                <w:noProof/>
+                <w:webHidden/>
+              </w:rPr>
+              <w:fldChar w:fldCharType="separate"/>
+            </w:r>
+            <w:r>
+              <w:rPr>
+                <w:noProof/>
+                <w:webHidden/>
+              </w:rPr>
+              <w:t>17</w:t>
+            </w:r>
+            <w:r>
+              <w:rPr>
+                <w:noProof/>
+                <w:webHidden/>
+              </w:rPr>
+              <w:fldChar w:fldCharType="end"/>
+            </w:r>
+          </w:hyperlink>
+        </w:p>
+        <w:p>
+          <w:pPr>
+            <w:pStyle w:val="Obsah1"/>
+            <w:rPr>
+              <w:rFonts w:eastAsiaTheme="minorEastAsia"/>
+              <w:noProof/>
+              <w:kern w:val="2"/>
+              <w:szCs w:val="24"/>
+              <w:lang w:eastAsia="cs-CZ"/>
+              <w14:ligatures w14:val="standardContextual"/>
+            </w:rPr>
+          </w:pPr>
+          <w:hyperlink w:anchor="_Toc227677900" w:history="1">
+            <w:r>
+              <w:rPr>
+                <w:rStyle w:val="Hypertextovodkaz"/>
+                <w:noProof/>
+              </w:rPr>
+              <w:t>Použité zdroje</w:t>
+            </w:r>
+            <w:r>
+              <w:rPr>
+                <w:noProof/>
+                <w:webHidden/>
+              </w:rPr>
+              <w:tab/>
+            </w:r>
+            <w:r>
+              <w:rPr>
+                <w:noProof/>
+                <w:webHidden/>
+              </w:rPr>
+              <w:fldChar w:fldCharType="begin"/>
+            </w:r>
+            <w:r>
+              <w:rPr>
+                <w:noProof/>
+                <w:webHidden/>
+              </w:rPr>
+              <w:instrText xml:space="preserve"> PAGEREF _Toc227677900 \h </w:instrText>
+            </w:r>
+            <w:r>
+              <w:rPr>
+                <w:noProof/>
+                <w:webHidden/>
+              </w:rPr>
+            </w:r>
+            <w:r>
+              <w:rPr>
+                <w:noProof/>
+                <w:webHidden/>
+              </w:rPr>
+              <w:fldChar w:fldCharType="separate"/>
+            </w:r>
+            <w:r>
+              <w:rPr>
+                <w:noProof/>
+                <w:webHidden/>
+              </w:rPr>
+              <w:t>18</w:t>
+            </w:r>
+            <w:r>
+              <w:rPr>
+                <w:noProof/>
+                <w:webHidden/>
+              </w:rPr>
+              <w:fldChar w:fldCharType="end"/>
+            </w:r>
+          </w:hyperlink>
+        </w:p>
+        <w:p>
+          <w:pPr>
+            <w:pStyle w:val="Obsah1"/>
+            <w:tabs>
+              <w:tab w:val="left" w:pos="720"/>
+            </w:tabs>
+            <w:rPr>
+              <w:rFonts w:eastAsiaTheme="minorEastAsia"/>
+              <w:noProof/>
+              <w:kern w:val="2"/>
+              <w:szCs w:val="24"/>
+              <w:lang w:eastAsia="cs-CZ"/>
+              <w14:ligatures w14:val="standardContextual"/>
+            </w:rPr>
+          </w:pPr>
+          <w:hyperlink w:anchor="_Toc227677901" w:history="1">
+            <w:r>
+              <w:rPr>
+                <w:rStyle w:val="Hypertextovodkaz"/>
+                <w:noProof/>
+              </w:rPr>
+              <w:t>A.</w:t>
+            </w:r>
+            <w:r>
+              <w:rPr>
+                <w:rFonts w:eastAsiaTheme="minorEastAsia"/>
+                <w:noProof/>
+                <w:kern w:val="2"/>
+                <w:szCs w:val="24"/>
+                <w:lang w:eastAsia="cs-CZ"/>
+                <w14:ligatures w14:val="standardContextual"/>
+              </w:rPr>
+              <w:tab/>
+            </w:r>
+            <w:r>
+              <w:rPr>
+                <w:rStyle w:val="Hypertextovodkaz"/>
+                <w:noProof/>
+              </w:rPr>
               <w:t>Seznam přiložených souborů</w:t>
             </w:r>
             <w:r>
@@ -6050,7 +6348,7 @@
                 <w:noProof/>
                 <w:webHidden/>
               </w:rPr>
-              <w:instrText xml:space="preserve"> PAGEREF _Toc227668241 \h </w:instrText>
+              <w:instrText xml:space="preserve"> PAGEREF _Toc227677901 \h </w:instrText>
             </w:r>
             <w:r>
               <w:rPr>
@@ -6108,7 +6406,7 @@
       </w:pPr>
       <w:bookmarkStart w:id="0" w:name="_Toc86047591"/>
       <w:bookmarkStart w:id="1" w:name="_Toc86055198"/>
-      <w:bookmarkStart w:id="2" w:name="_Toc227668186"/>
+      <w:bookmarkStart w:id="2" w:name="_Toc227677844"/>
       <w:r>
         <w:lastRenderedPageBreak/>
         <w:t>Úvod</w:t>
@@ -6120,242 +6418,377 @@
     <w:p>
       <w:pPr>
         <w:pStyle w:val="Sta"/>
-      </w:pPr>
-      <w:r>
-        <w:t xml:space="preserve">Sledování stravy je dnes často vnímáno jako bariéra kvůli časové náročnosti a nepřehlednosti běžných aplikací, které uživatele po několika dnech demotivují. Aplikace </w:t>
+        <w:rPr>
+          <w:lang w:eastAsia="en-US"/>
+        </w:rPr>
+      </w:pPr>
+      <w:r>
+        <w:rPr>
+          <w:lang w:eastAsia="en-US"/>
+        </w:rPr>
+        <w:t xml:space="preserve">Sledování stravy a obecně kalorií je dnes často vnímáno jako překážka kvůli časové náročnosti, nepřehlednosti a ztráty motivace </w:t>
+      </w:r>
+      <w:r>
+        <w:rPr>
+          <w:lang w:eastAsia="en-US"/>
+        </w:rPr>
+        <w:t xml:space="preserve">běžných nutričních aplikací, které uživatele po několika dnech demotivují. Aplikace </w:t>
       </w:r>
       <w:proofErr w:type="spellStart"/>
       <w:r>
         <w:rPr>
-          <w:b/>
-          <w:bCs/>
+          <w:lang w:eastAsia="en-US"/>
         </w:rPr>
         <w:t>Yumi</w:t>
       </w:r>
       <w:proofErr w:type="spellEnd"/>
       <w:r>
-        <w:t xml:space="preserve"> vzniká s cílem tento proces zjednodušit a vytvořit intuitivní, vizuálně přitažlivé rozhraní, které uživatele neodrazuje, ale skutečně mu pomáhá dosahovat jeho cílů.</w:t>
+        <w:rPr>
+          <w:lang w:eastAsia="en-US"/>
+        </w:rPr>
+        <w:t xml:space="preserve"> proto vzniká s cílem vytvořit přívětivější rozhraní, které </w:t>
+      </w:r>
+      <w:proofErr w:type="spellStart"/>
+      <w:r>
+        <w:rPr>
+          <w:lang w:eastAsia="en-US"/>
+        </w:rPr>
+        <w:t>bežné</w:t>
+      </w:r>
+      <w:proofErr w:type="spellEnd"/>
+      <w:r>
+        <w:rPr>
+          <w:lang w:eastAsia="en-US"/>
+        </w:rPr>
+        <w:t xml:space="preserve"> uživatele neodrazuje, ale skutečně mu pomáhá plnit jeho cíle</w:t>
       </w:r>
     </w:p>
     <w:p>
       <w:pPr>
         <w:pStyle w:val="Sta"/>
-      </w:pPr>
-      <w:r>
-        <w:t xml:space="preserve">Hlavním cílem práce je vývoj mobilní aplikace pro platformy iOS a Android za využití frameworků </w:t>
+        <w:ind w:firstLine="0"/>
+        <w:rPr>
+          <w:lang w:eastAsia="en-US"/>
+        </w:rPr>
+      </w:pPr>
+      <w:r>
+        <w:rPr>
+          <w:lang w:eastAsia="en-US"/>
+        </w:rPr>
+        <w:tab/>
+        <w:t xml:space="preserve">Hlavním cílem práce je vyvinutí multiplatformní aplikace pro platformy: </w:t>
       </w:r>
       <w:proofErr w:type="spellStart"/>
       <w:r>
+        <w:rPr>
+          <w:lang w:eastAsia="en-US"/>
+        </w:rPr>
+        <w:t>ios</w:t>
+      </w:r>
+      <w:proofErr w:type="spellEnd"/>
+      <w:r>
+        <w:rPr>
+          <w:lang w:eastAsia="en-US"/>
+        </w:rPr>
+        <w:t xml:space="preserve"> a Android s využitím frameworků </w:t>
+      </w:r>
+      <w:proofErr w:type="spellStart"/>
+      <w:r>
+        <w:rPr>
+          <w:lang w:eastAsia="en-US"/>
+        </w:rPr>
         <w:t>React</w:t>
       </w:r>
       <w:proofErr w:type="spellEnd"/>
       <w:r>
+        <w:rPr>
+          <w:lang w:eastAsia="en-US"/>
+        </w:rPr>
         <w:t xml:space="preserve"> </w:t>
       </w:r>
       <w:proofErr w:type="spellStart"/>
       <w:r>
+        <w:rPr>
+          <w:lang w:eastAsia="en-US"/>
+        </w:rPr>
         <w:t>Native</w:t>
       </w:r>
       <w:proofErr w:type="spellEnd"/>
       <w:r>
-        <w:t xml:space="preserve"> a Expo. Součástí projektu je také kompletní proces přípravy pro nasazení do digitálních obchodů Apple </w:t>
+        <w:rPr>
+          <w:lang w:eastAsia="en-US"/>
+        </w:rPr>
+        <w:t xml:space="preserve">, který je postavený na technologii </w:t>
       </w:r>
       <w:proofErr w:type="spellStart"/>
       <w:r>
+        <w:rPr>
+          <w:lang w:eastAsia="en-US"/>
+        </w:rPr>
+        <w:t>React</w:t>
+      </w:r>
+      <w:proofErr w:type="spellEnd"/>
+      <w:r>
+        <w:rPr>
+          <w:lang w:eastAsia="en-US"/>
+        </w:rPr>
+        <w:t xml:space="preserve"> a Expo, který je přímo vytvořený pro usnadnění vývoje v </w:t>
+      </w:r>
+      <w:proofErr w:type="spellStart"/>
+      <w:r>
+        <w:rPr>
+          <w:lang w:eastAsia="en-US"/>
+        </w:rPr>
+        <w:t>React</w:t>
+      </w:r>
+      <w:proofErr w:type="spellEnd"/>
+      <w:r>
+        <w:rPr>
+          <w:lang w:eastAsia="en-US"/>
+        </w:rPr>
+        <w:t xml:space="preserve"> </w:t>
+      </w:r>
+      <w:proofErr w:type="spellStart"/>
+      <w:r>
+        <w:rPr>
+          <w:lang w:eastAsia="en-US"/>
+        </w:rPr>
+        <w:t>Native</w:t>
+      </w:r>
+      <w:proofErr w:type="spellEnd"/>
+      <w:r>
+        <w:rPr>
+          <w:lang w:eastAsia="en-US"/>
+        </w:rPr>
+        <w:t xml:space="preserve">. Součástí projektu je také kompletní proces přípravy pro nasazení do obchodů </w:t>
+      </w:r>
+      <w:proofErr w:type="spellStart"/>
+      <w:r>
+        <w:rPr>
+          <w:lang w:eastAsia="en-US"/>
+        </w:rPr>
         <w:t>App</w:t>
       </w:r>
       <w:proofErr w:type="spellEnd"/>
       <w:r>
+        <w:rPr>
+          <w:lang w:eastAsia="en-US"/>
+        </w:rPr>
         <w:t xml:space="preserve"> </w:t>
       </w:r>
       <w:proofErr w:type="spellStart"/>
       <w:r>
+        <w:rPr>
+          <w:lang w:eastAsia="en-US"/>
+        </w:rPr>
         <w:t>Store</w:t>
       </w:r>
       <w:proofErr w:type="spellEnd"/>
       <w:r>
-        <w:t xml:space="preserve"> a Google Play, což zahrnuje nezbytnou konfiguraci vývojářských účtů v programech </w:t>
-      </w:r>
-      <w:r>
         <w:rPr>
-          <w:b/>
-          <w:bCs/>
+          <w:lang w:eastAsia="en-US"/>
         </w:rPr>
-        <w:t>Apple Developer</w:t>
-      </w:r>
-      <w:r>
-        <w:t xml:space="preserve"> a </w:t>
-      </w:r>
+        <w:t xml:space="preserve"> a Google Play, což zahrnuje nezbytnou </w:t>
+      </w:r>
+      <w:proofErr w:type="spellStart"/>
       <w:r>
         <w:rPr>
-          <w:b/>
-          <w:bCs/>
+          <w:lang w:eastAsia="en-US"/>
         </w:rPr>
-        <w:t xml:space="preserve">Google Play </w:t>
+        <w:t>konfiguraaci</w:t>
+      </w:r>
+      <w:proofErr w:type="spellEnd"/>
+      <w:r>
+        <w:rPr>
+          <w:lang w:eastAsia="en-US"/>
+        </w:rPr>
+        <w:t xml:space="preserve"> v programech Apple Developer a Google Play </w:t>
       </w:r>
       <w:proofErr w:type="spellStart"/>
       <w:r>
         <w:rPr>
-          <w:b/>
-          <w:bCs/>
+          <w:lang w:eastAsia="en-US"/>
         </w:rPr>
         <w:t>Console</w:t>
       </w:r>
       <w:proofErr w:type="spellEnd"/>
       <w:r>
-        <w:t>. Projekt se zaměřuje na odstranění nedostatků typických pro konkurenční řešení, která často strádají zastaralým uživatelským rozhraním (UI), špatně navrženou uživatelskou zkušeností (UX) nebo neschopností udržet dlouhodobou motivaci k používání.</w:t>
+        <w:rPr>
+          <w:lang w:eastAsia="en-US"/>
+        </w:rPr>
+        <w:t>. Projekt řeší odstranění</w:t>
+      </w:r>
+      <w:r>
+        <w:rPr>
+          <w:lang w:eastAsia="en-US"/>
+        </w:rPr>
+        <w:t xml:space="preserve"> nedostatků typických pro konkurenční řešení, která často působí zastaralým uživatelským rozhraním (UI), a nepohodlným používáním aplikace, které se často označuje jako UX.</w:t>
       </w:r>
     </w:p>
     <w:p>
       <w:pPr>
         <w:pStyle w:val="Sta"/>
-      </w:pPr>
-      <w:r>
-        <w:t xml:space="preserve">Důležitým pilířem je vytvoření </w:t>
+        <w:ind w:firstLine="0"/>
+        <w:rPr>
+          <w:lang w:eastAsia="en-US"/>
+        </w:rPr>
+      </w:pPr>
+      <w:r>
+        <w:rPr>
+          <w:lang w:eastAsia="en-US"/>
+        </w:rPr>
+        <w:tab/>
       </w:r>
       <w:proofErr w:type="spellStart"/>
       <w:r>
-        <w:t>backendového</w:t>
+        <w:rPr>
+          <w:lang w:eastAsia="en-US"/>
+        </w:rPr>
+        <w:t>Duležitým</w:t>
       </w:r>
       <w:proofErr w:type="spellEnd"/>
       <w:r>
-        <w:t xml:space="preserve"> systému na platformě </w:t>
+        <w:rPr>
+          <w:lang w:eastAsia="en-US"/>
+        </w:rPr>
+        <w:t xml:space="preserve"> pilířem projektu je </w:t>
       </w:r>
       <w:proofErr w:type="spellStart"/>
       <w:r>
+        <w:rPr>
+          <w:lang w:eastAsia="en-US"/>
+        </w:rPr>
+        <w:t>backendový</w:t>
+      </w:r>
+      <w:proofErr w:type="spellEnd"/>
+      <w:r>
+        <w:rPr>
+          <w:lang w:eastAsia="en-US"/>
+        </w:rPr>
+        <w:t xml:space="preserve"> systém postavený na platformě </w:t>
+      </w:r>
+      <w:proofErr w:type="spellStart"/>
+      <w:r>
+        <w:rPr>
+          <w:lang w:eastAsia="en-US"/>
+        </w:rPr>
         <w:t>Supabase</w:t>
       </w:r>
       <w:proofErr w:type="spellEnd"/>
       <w:r>
-        <w:t xml:space="preserve"> (</w:t>
+        <w:rPr>
+          <w:lang w:eastAsia="en-US"/>
+        </w:rPr>
+        <w:t xml:space="preserve"> (Baas) pro správu dat komunitních funkcí. Pro klíčovou </w:t>
+      </w:r>
+      <w:proofErr w:type="gramStart"/>
+      <w:r>
+        <w:rPr>
+          <w:lang w:eastAsia="en-US"/>
+        </w:rPr>
+        <w:t>funkci</w:t>
+      </w:r>
+      <w:proofErr w:type="gramEnd"/>
+      <w:r>
+        <w:rPr>
+          <w:lang w:eastAsia="en-US"/>
+        </w:rPr>
+        <w:t xml:space="preserve"> na které je tato aplikace postavená je rychlá analýza jídla, která se řeší pomocí AI modelů </w:t>
       </w:r>
       <w:proofErr w:type="spellStart"/>
       <w:r>
-        <w:t>B</w:t>
-      </w:r>
-      <w:r>
-        <w:t>aaS</w:t>
-      </w:r>
-      <w:proofErr w:type="spellEnd"/>
-      <w:r>
-        <w:t>)</w:t>
-      </w:r>
-      <w:r>
-        <w:t xml:space="preserve"> pro efektivní správu dat a komunitních funkcí. Pro klíčovou funkci rychlé analýzy jídla a rozpoznávání obrazu jsou do aplikace integrovány pokročilé API modely </w:t>
-      </w:r>
-      <w:proofErr w:type="spellStart"/>
-      <w:r>
         <w:rPr>
-          <w:b/>
-          <w:bCs/>
+          <w:lang w:eastAsia="en-US"/>
         </w:rPr>
         <w:t>Gemini</w:t>
       </w:r>
       <w:proofErr w:type="spellEnd"/>
       <w:r>
         <w:rPr>
-          <w:b/>
-          <w:bCs/>
+          <w:lang w:eastAsia="en-US"/>
         </w:rPr>
         <w:t xml:space="preserve"> 3.1 </w:t>
       </w:r>
       <w:proofErr w:type="spellStart"/>
       <w:r>
         <w:rPr>
-          <w:b/>
-          <w:bCs/>
+          <w:lang w:eastAsia="en-US"/>
         </w:rPr>
         <w:t>Flash</w:t>
       </w:r>
       <w:proofErr w:type="spellEnd"/>
       <w:r>
         <w:rPr>
-          <w:b/>
-          <w:bCs/>
+          <w:lang w:eastAsia="en-US"/>
         </w:rPr>
-        <w:t xml:space="preserve"> Lite</w:t>
+        <w:t xml:space="preserve"> Lite a GPT-5 Mini.</w:t>
       </w:r>
       <w:r>
         <w:rPr>
-          <w:b/>
-          <w:bCs/>
+          <w:lang w:eastAsia="en-US"/>
+        </w:rPr>
+        <w:t xml:space="preserve"> Práce také zahrnuje implementaci platební brány Stripe </w:t>
+      </w:r>
+      <w:r>
+        <w:rPr>
+          <w:lang w:eastAsia="en-US"/>
+        </w:rPr>
+        <w:t>(</w:t>
+      </w:r>
+      <w:proofErr w:type="spellStart"/>
+      <w:r>
+        <w:rPr>
+          <w:lang w:eastAsia="en-US"/>
+        </w:rPr>
+        <w:t>FinTech</w:t>
+      </w:r>
+      <w:proofErr w:type="spellEnd"/>
+      <w:r>
+        <w:rPr>
+          <w:lang w:eastAsia="en-US"/>
         </w:rPr>
         <w:t xml:space="preserve"> </w:t>
       </w:r>
-      <w:r>
-        <w:t xml:space="preserve">a </w:t>
-      </w:r>
+      <w:proofErr w:type="spellStart"/>
       <w:r>
         <w:rPr>
-          <w:b/>
-          <w:bCs/>
+          <w:lang w:eastAsia="en-US"/>
         </w:rPr>
-        <w:t>GPT-5 Mini</w:t>
-      </w:r>
-      <w:r>
-        <w:t xml:space="preserve">. Tato integrace umožňuje automatizovat zápis nutričních hodnot, čímž </w:t>
+        <w:t>SaaS</w:t>
+      </w:r>
+      <w:proofErr w:type="spellEnd"/>
+      <w:r>
+        <w:rPr>
+          <w:lang w:eastAsia="en-US"/>
+        </w:rPr>
+        <w:t>),</w:t>
+      </w:r>
+      <w:r>
+        <w:rPr>
+          <w:lang w:eastAsia="en-US"/>
+        </w:rPr>
+        <w:t xml:space="preserve"> která zajišťuje bezpečné zpracování transakcí a správu předplatného pro prémiové funkce. Práce dokumentuje kompletní proces vývoje od prvotního návrhu v programu </w:t>
       </w:r>
       <w:proofErr w:type="spellStart"/>
       <w:r>
-        <w:t>Yumi</w:t>
+        <w:rPr>
+          <w:lang w:eastAsia="en-US"/>
+        </w:rPr>
+        <w:t>Figma</w:t>
       </w:r>
       <w:proofErr w:type="spellEnd"/>
       <w:r>
-        <w:t xml:space="preserve"> reaguje na absenci moderních technologií a fungující komunity u stávajících aplikací. Práce také zahrnuje implementaci platební brány </w:t>
-      </w:r>
-      <w:r>
         <w:rPr>
-          <w:b/>
-          <w:bCs/>
+          <w:lang w:eastAsia="en-US"/>
         </w:rPr>
-        <w:t>Stripe</w:t>
-      </w:r>
-      <w:r>
-        <w:rPr>
-          <w:b/>
-          <w:bCs/>
-        </w:rPr>
-        <w:t xml:space="preserve"> </w:t>
-      </w:r>
-      <w:r>
-        <w:t>(</w:t>
-      </w:r>
-      <w:proofErr w:type="spellStart"/>
-      <w:r>
-        <w:t>FinTech</w:t>
-      </w:r>
-      <w:proofErr w:type="spellEnd"/>
-      <w:r>
-        <w:t xml:space="preserve"> </w:t>
-      </w:r>
-      <w:proofErr w:type="spellStart"/>
-      <w:r>
-        <w:t>SaaS</w:t>
-      </w:r>
-      <w:proofErr w:type="spellEnd"/>
-      <w:r>
-        <w:t>)</w:t>
-      </w:r>
-      <w:r>
-        <w:t xml:space="preserve">, </w:t>
-      </w:r>
-      <w:r>
-        <w:t>která zajišťuje bezpečné zpracování transakcí a správu předplatného pro prémiové funkce aplikace. Právě pocit izolace a složitost zadávání dat jsou nejčastějšími důvody pro předčasné ukončení sledování stravy.</w:t>
+        <w:t xml:space="preserve"> přes implementaci analýz obrazu a platebních mechanismů až tvorbu systému klubů, které dělají ze správy jídelníčku udržitelný a přirozený zvyk.</w:t>
       </w:r>
     </w:p>
     <w:p>
       <w:pPr>
-        <w:pStyle w:val="Sta"/>
-      </w:pPr>
-      <w:r>
-        <w:t>Práce dokumentuje kompletní proces vývoje od prvotního grafického návrhu přes implementaci inteligentních analýz a platebních mechanismů až po vytvoření systému klubů, které dělají ze správy jídelníčku udržitelný a přirozený zvyk.</w:t>
-      </w:r>
-    </w:p>
-    <w:p>
-      <w:pPr>
         <w:pStyle w:val="Nadpis1"/>
       </w:pPr>
-      <w:bookmarkStart w:id="3" w:name="_Toc227668187"/>
+      <w:bookmarkStart w:id="3" w:name="_Toc227677845"/>
       <w:r>
         <w:lastRenderedPageBreak/>
         <w:t>Analýza trhu a uživatelské motivace</w:t>
@@ -6366,7 +6799,7 @@
       <w:pPr>
         <w:pStyle w:val="Nadpis2"/>
       </w:pPr>
-      <w:bookmarkStart w:id="4" w:name="_Toc227668188"/>
+      <w:bookmarkStart w:id="4" w:name="_Toc227677846"/>
       <w:r>
         <w:t>Průzkum stávajících řešení</w:t>
       </w:r>
@@ -6376,7 +6809,7 @@
       <w:pPr>
         <w:pStyle w:val="Nadpis2"/>
       </w:pPr>
-      <w:bookmarkStart w:id="5" w:name="_Toc227668189"/>
+      <w:bookmarkStart w:id="5" w:name="_Toc227677847"/>
       <w:r>
         <w:t>Psychologie bariéry</w:t>
       </w:r>
@@ -6386,7 +6819,7 @@
       <w:pPr>
         <w:pStyle w:val="Nadpis2"/>
       </w:pPr>
-      <w:bookmarkStart w:id="6" w:name="_Toc227668190"/>
+      <w:bookmarkStart w:id="6" w:name="_Toc227677848"/>
       <w:r>
         <w:t xml:space="preserve">Konkurenční výhoda </w:t>
       </w:r>
@@ -6404,7 +6837,7 @@
       <w:pPr>
         <w:pStyle w:val="Nadpis2"/>
       </w:pPr>
-      <w:bookmarkStart w:id="7" w:name="_Toc227668191"/>
+      <w:bookmarkStart w:id="7" w:name="_Toc227677849"/>
       <w:r>
         <w:t>Uživatelský profil</w:t>
       </w:r>
@@ -6414,10 +6847,21 @@
       <w:pPr>
         <w:pStyle w:val="Nadpis1"/>
       </w:pPr>
-      <w:bookmarkStart w:id="8" w:name="_Toc227668192"/>
+      <w:bookmarkStart w:id="8" w:name="_Toc227677850"/>
       <w:r>
         <w:lastRenderedPageBreak/>
         <w:t>Vizuální identita a UX Design</w:t>
+      </w:r>
+      <w:r>
+        <w:t xml:space="preserve"> (</w:t>
+      </w:r>
+      <w:proofErr w:type="spellStart"/>
+      <w:r>
+        <w:t>Figma</w:t>
+      </w:r>
+      <w:proofErr w:type="spellEnd"/>
+      <w:r>
+        <w:t>)</w:t>
       </w:r>
       <w:bookmarkEnd w:id="8"/>
     </w:p>
@@ -6425,7 +6869,7 @@
       <w:pPr>
         <w:pStyle w:val="Nadpis2"/>
       </w:pPr>
-      <w:bookmarkStart w:id="9" w:name="_Toc227668193"/>
+      <w:bookmarkStart w:id="9" w:name="_Toc227677851"/>
       <w:r>
         <w:t>Designová filozofie</w:t>
       </w:r>
@@ -6435,7 +6879,7 @@
       <w:pPr>
         <w:pStyle w:val="Nadpis2"/>
       </w:pPr>
-      <w:bookmarkStart w:id="10" w:name="_Toc227668194"/>
+      <w:bookmarkStart w:id="10" w:name="_Toc227677852"/>
       <w:r>
         <w:t>Barevná paleta a symbolika</w:t>
       </w:r>
@@ -6445,7 +6889,7 @@
       <w:pPr>
         <w:pStyle w:val="Nadpis2"/>
       </w:pPr>
-      <w:bookmarkStart w:id="11" w:name="_Toc227668195"/>
+      <w:bookmarkStart w:id="11" w:name="_Toc227677853"/>
       <w:r>
         <w:t>Typografie</w:t>
       </w:r>
@@ -6455,7 +6899,7 @@
       <w:pPr>
         <w:pStyle w:val="Nadpis2"/>
       </w:pPr>
-      <w:bookmarkStart w:id="12" w:name="_Toc227668196"/>
+      <w:bookmarkStart w:id="12" w:name="_Toc227677854"/>
       <w:r>
         <w:t>Role maskota</w:t>
       </w:r>
@@ -6465,7 +6909,7 @@
       <w:pPr>
         <w:pStyle w:val="Nadpis1"/>
       </w:pPr>
-      <w:bookmarkStart w:id="13" w:name="_Toc227668197"/>
+      <w:bookmarkStart w:id="13" w:name="_Toc227677855"/>
       <w:r>
         <w:lastRenderedPageBreak/>
         <w:t>Návrh rozhraní a technická architektura</w:t>
@@ -6476,7 +6920,7 @@
       <w:pPr>
         <w:pStyle w:val="Nadpis2"/>
       </w:pPr>
-      <w:bookmarkStart w:id="14" w:name="_Toc227668198"/>
+      <w:bookmarkStart w:id="14" w:name="_Toc227677856"/>
       <w:r>
         <w:t>Metodika návrhu uživatelské zkušenosti (UX)</w:t>
       </w:r>
@@ -6486,7 +6930,7 @@
       <w:pPr>
         <w:pStyle w:val="Nadpis3"/>
       </w:pPr>
-      <w:bookmarkStart w:id="15" w:name="_Toc227668199"/>
+      <w:bookmarkStart w:id="15" w:name="_Toc227677857"/>
       <w:r>
         <w:t>Analýza uživatelských cest</w:t>
       </w:r>
@@ -6496,7 +6940,7 @@
       <w:pPr>
         <w:pStyle w:val="Nadpis3"/>
       </w:pPr>
-      <w:bookmarkStart w:id="16" w:name="_Toc227668200"/>
+      <w:bookmarkStart w:id="16" w:name="_Toc227677858"/>
       <w:r>
         <w:t>Informační architektura</w:t>
       </w:r>
@@ -6506,7 +6950,7 @@
       <w:pPr>
         <w:pStyle w:val="Nadpis2"/>
       </w:pPr>
-      <w:bookmarkStart w:id="17" w:name="_Toc227668201"/>
+      <w:bookmarkStart w:id="17" w:name="_Toc227677859"/>
       <w:r>
         <w:t>UI design</w:t>
       </w:r>
@@ -6516,7 +6960,7 @@
       <w:pPr>
         <w:pStyle w:val="Nadpis3"/>
       </w:pPr>
-      <w:bookmarkStart w:id="18" w:name="_Toc227668202"/>
+      <w:bookmarkStart w:id="18" w:name="_Toc227677860"/>
       <w:r>
         <w:t>Tvorba grafického stylu</w:t>
       </w:r>
@@ -6526,7 +6970,7 @@
       <w:pPr>
         <w:pStyle w:val="Nadpis3"/>
       </w:pPr>
-      <w:bookmarkStart w:id="19" w:name="_Toc227668203"/>
+      <w:bookmarkStart w:id="19" w:name="_Toc227677861"/>
       <w:r>
         <w:t>Implementace maskota</w:t>
       </w:r>
@@ -6536,7 +6980,7 @@
       <w:pPr>
         <w:pStyle w:val="Nadpis3"/>
       </w:pPr>
-      <w:bookmarkStart w:id="20" w:name="_Toc227668204"/>
+      <w:bookmarkStart w:id="20" w:name="_Toc227677862"/>
       <w:r>
         <w:t>Typografický systém</w:t>
       </w:r>
@@ -6546,7 +6990,7 @@
       <w:pPr>
         <w:pStyle w:val="Nadpis2"/>
       </w:pPr>
-      <w:bookmarkStart w:id="21" w:name="_Toc227668205"/>
+      <w:bookmarkStart w:id="21" w:name="_Toc227677863"/>
       <w:proofErr w:type="spellStart"/>
       <w:r>
         <w:t>Frontendový</w:t>
@@ -6561,7 +7005,7 @@
       <w:pPr>
         <w:pStyle w:val="Nadpis3"/>
       </w:pPr>
-      <w:bookmarkStart w:id="22" w:name="_Toc227668206"/>
+      <w:bookmarkStart w:id="22" w:name="_Toc227677864"/>
       <w:r>
         <w:t>Volba technologií</w:t>
       </w:r>
@@ -6571,7 +7015,7 @@
       <w:pPr>
         <w:pStyle w:val="Nadpis3"/>
       </w:pPr>
-      <w:bookmarkStart w:id="23" w:name="_Toc227668207"/>
+      <w:bookmarkStart w:id="23" w:name="_Toc227677865"/>
       <w:r>
         <w:t>Správa vývojového cyklu</w:t>
       </w:r>
@@ -6581,7 +7025,7 @@
       <w:pPr>
         <w:pStyle w:val="Nadpis2"/>
       </w:pPr>
-      <w:bookmarkStart w:id="24" w:name="_Toc227668208"/>
+      <w:bookmarkStart w:id="24" w:name="_Toc227677866"/>
       <w:r>
         <w:t>Souborový systém a navigační struktura</w:t>
       </w:r>
@@ -6591,7 +7035,7 @@
       <w:pPr>
         <w:pStyle w:val="Nadpis3"/>
       </w:pPr>
-      <w:bookmarkStart w:id="25" w:name="_Toc227668209"/>
+      <w:bookmarkStart w:id="25" w:name="_Toc227677867"/>
       <w:r>
         <w:t>Expo Router</w:t>
       </w:r>
@@ -6601,7 +7045,7 @@
       <w:pPr>
         <w:pStyle w:val="Nadpis3"/>
       </w:pPr>
-      <w:bookmarkStart w:id="26" w:name="_Toc227668210"/>
+      <w:bookmarkStart w:id="26" w:name="_Toc227677868"/>
       <w:r>
         <w:t>Organizace projektu</w:t>
       </w:r>
@@ -6611,7 +7055,7 @@
       <w:pPr>
         <w:pStyle w:val="Nadpis3"/>
       </w:pPr>
-      <w:bookmarkStart w:id="27" w:name="_Toc227668211"/>
+      <w:bookmarkStart w:id="27" w:name="_Toc227677869"/>
       <w:r>
         <w:t>Dynamické směrování</w:t>
       </w:r>
@@ -6621,7 +7065,7 @@
       <w:pPr>
         <w:pStyle w:val="Nadpis2"/>
       </w:pPr>
-      <w:bookmarkStart w:id="28" w:name="_Toc227668212"/>
+      <w:bookmarkStart w:id="28" w:name="_Toc227677870"/>
       <w:proofErr w:type="spellStart"/>
       <w:r>
         <w:t>Backendové</w:t>
@@ -6647,7 +7091,7 @@
       <w:pPr>
         <w:pStyle w:val="Nadpis3"/>
       </w:pPr>
-      <w:bookmarkStart w:id="29" w:name="_Toc227668213"/>
+      <w:bookmarkStart w:id="29" w:name="_Toc227677871"/>
       <w:proofErr w:type="spellStart"/>
       <w:r>
         <w:t>Supabase</w:t>
@@ -6659,7 +7103,7 @@
       <w:pPr>
         <w:pStyle w:val="Nadpis3"/>
       </w:pPr>
-      <w:bookmarkStart w:id="30" w:name="_Toc227668214"/>
+      <w:bookmarkStart w:id="30" w:name="_Toc227677872"/>
       <w:r>
         <w:lastRenderedPageBreak/>
         <w:t>Bezpečnost dat</w:t>
@@ -6670,7 +7114,7 @@
       <w:pPr>
         <w:pStyle w:val="Nadpis2"/>
       </w:pPr>
-      <w:bookmarkStart w:id="31" w:name="_Toc227668215"/>
+      <w:bookmarkStart w:id="31" w:name="_Toc227677873"/>
       <w:r>
         <w:t>Styling a transformace designu do kódu</w:t>
       </w:r>
@@ -6680,7 +7124,7 @@
       <w:pPr>
         <w:pStyle w:val="Nadpis3"/>
       </w:pPr>
-      <w:bookmarkStart w:id="32" w:name="_Toc227668216"/>
+      <w:bookmarkStart w:id="32" w:name="_Toc227677874"/>
       <w:proofErr w:type="spellStart"/>
       <w:r>
         <w:t>NativeWind</w:t>
@@ -6692,7 +7136,7 @@
       <w:pPr>
         <w:pStyle w:val="Nadpis3"/>
       </w:pPr>
-      <w:bookmarkStart w:id="33" w:name="_Toc227668217"/>
+      <w:bookmarkStart w:id="33" w:name="_Toc227677875"/>
       <w:r>
         <w:t xml:space="preserve">Konfigurace </w:t>
       </w:r>
@@ -6705,75 +7149,77 @@
     </w:p>
     <w:p>
       <w:pPr>
-        <w:pStyle w:val="Nadpis1"/>
-      </w:pPr>
-      <w:bookmarkStart w:id="34" w:name="_Toc227668218"/>
-      <w:r>
-        <w:lastRenderedPageBreak/>
-        <w:t>Inteligentní moduly a AI integrace</w:t>
+        <w:pStyle w:val="Nadpis2"/>
+      </w:pPr>
+      <w:bookmarkStart w:id="34" w:name="_Toc227677876"/>
+      <w:proofErr w:type="spellStart"/>
+      <w:r>
+        <w:t>Endpointy</w:t>
       </w:r>
       <w:bookmarkEnd w:id="34"/>
-    </w:p>
-    <w:p>
-      <w:pPr>
-        <w:pStyle w:val="Nadpis2"/>
-      </w:pPr>
-      <w:bookmarkStart w:id="35" w:name="_Toc227668219"/>
-      <w:proofErr w:type="spellStart"/>
-      <w:r>
-        <w:t>Magic</w:t>
-      </w:r>
-      <w:proofErr w:type="spellEnd"/>
-      <w:r>
-        <w:t xml:space="preserve"> </w:t>
-      </w:r>
-      <w:proofErr w:type="spellStart"/>
-      <w:r>
-        <w:t>Scan</w:t>
-      </w:r>
-      <w:bookmarkEnd w:id="35"/>
       <w:proofErr w:type="spellEnd"/>
     </w:p>
     <w:p>
       <w:pPr>
-        <w:pStyle w:val="Nadpis3"/>
-      </w:pPr>
-      <w:bookmarkStart w:id="36" w:name="_Toc227668220"/>
-      <w:proofErr w:type="spellStart"/>
-      <w:r>
-        <w:t>Gemini</w:t>
-      </w:r>
-      <w:proofErr w:type="spellEnd"/>
-      <w:r>
-        <w:t xml:space="preserve"> 3.1 </w:t>
-      </w:r>
-      <w:proofErr w:type="spellStart"/>
-      <w:r>
-        <w:t>Flash</w:t>
-      </w:r>
-      <w:proofErr w:type="spellEnd"/>
-      <w:r>
-        <w:t xml:space="preserve"> Lite G</w:t>
-      </w:r>
-      <w:bookmarkEnd w:id="36"/>
+        <w:pStyle w:val="Nadpis1"/>
+      </w:pPr>
+      <w:bookmarkStart w:id="35" w:name="_Toc227677877"/>
+      <w:r>
+        <w:lastRenderedPageBreak/>
+        <w:t>Inteligentní moduly a AI integrace</w:t>
+      </w:r>
+      <w:bookmarkEnd w:id="35"/>
     </w:p>
     <w:p>
       <w:pPr>
+        <w:pStyle w:val="Nadpis2"/>
+      </w:pPr>
+      <w:bookmarkStart w:id="36" w:name="_Toc227677878"/>
+      <w:proofErr w:type="spellStart"/>
+      <w:r>
+        <w:t>Magic</w:t>
+      </w:r>
+      <w:proofErr w:type="spellEnd"/>
+      <w:r>
+        <w:t xml:space="preserve"> </w:t>
+      </w:r>
+      <w:proofErr w:type="spellStart"/>
+      <w:r>
+        <w:t>Scan</w:t>
+      </w:r>
+      <w:bookmarkEnd w:id="36"/>
+      <w:proofErr w:type="spellEnd"/>
+    </w:p>
+    <w:p>
+      <w:pPr>
         <w:pStyle w:val="Nadpis3"/>
       </w:pPr>
-      <w:bookmarkStart w:id="37" w:name="_Toc227668221"/>
-      <w:r>
-        <w:t>GPT-5 Mini</w:t>
+      <w:bookmarkStart w:id="37" w:name="_Toc227677879"/>
+      <w:proofErr w:type="spellStart"/>
+      <w:r>
+        <w:t>Gemini</w:t>
+      </w:r>
+      <w:proofErr w:type="spellEnd"/>
+      <w:r>
+        <w:t xml:space="preserve"> 3.1 </w:t>
+      </w:r>
+      <w:proofErr w:type="spellStart"/>
+      <w:r>
+        <w:t>Flash</w:t>
+      </w:r>
+      <w:proofErr w:type="spellEnd"/>
+      <w:r>
+        <w:t xml:space="preserve"> Lite G</w:t>
       </w:r>
       <w:bookmarkEnd w:id="37"/>
     </w:p>
     <w:p>
       <w:pPr>
-        <w:pStyle w:val="Nadpis2"/>
-      </w:pPr>
-      <w:bookmarkStart w:id="38" w:name="_Toc227668222"/>
-      <w:r>
-        <w:t>Databáze a API</w:t>
+        <w:pStyle w:val="Nadpis3"/>
+      </w:pPr>
+      <w:bookmarkStart w:id="38" w:name="_Toc227677880"/>
+      <w:r>
+        <w:t>GPT-5 Mini</w:t>
       </w:r>
       <w:bookmarkEnd w:id="38"/>
     </w:p>
@@ -6781,30 +7227,30 @@
       <w:pPr>
         <w:pStyle w:val="Nadpis2"/>
       </w:pPr>
-      <w:bookmarkStart w:id="39" w:name="_Toc227668223"/>
-      <w:r>
-        <w:t>Uživatelský scénář</w:t>
+      <w:bookmarkStart w:id="39" w:name="_Toc227677881"/>
+      <w:r>
+        <w:t>Databáze a API</w:t>
       </w:r>
       <w:bookmarkEnd w:id="39"/>
     </w:p>
     <w:p>
       <w:pPr>
-        <w:pStyle w:val="Nadpis1"/>
-      </w:pPr>
-      <w:bookmarkStart w:id="40" w:name="_Toc227668224"/>
-      <w:r>
-        <w:lastRenderedPageBreak/>
-        <w:t>Komunita a sociální interakce</w:t>
+        <w:pStyle w:val="Nadpis2"/>
+      </w:pPr>
+      <w:bookmarkStart w:id="40" w:name="_Toc227677882"/>
+      <w:r>
+        <w:t>Uživatelský scénář</w:t>
       </w:r>
       <w:bookmarkEnd w:id="40"/>
     </w:p>
     <w:p>
       <w:pPr>
-        <w:pStyle w:val="Nadpis2"/>
-      </w:pPr>
-      <w:bookmarkStart w:id="41" w:name="_Toc227668225"/>
-      <w:r>
-        <w:t>Systém vnořených klubů</w:t>
+        <w:pStyle w:val="Nadpis1"/>
+      </w:pPr>
+      <w:bookmarkStart w:id="41" w:name="_Toc227677883"/>
+      <w:r>
+        <w:lastRenderedPageBreak/>
+        <w:t>Komunita a sociální interakce</w:t>
       </w:r>
       <w:bookmarkEnd w:id="41"/>
     </w:p>
@@ -6812,36 +7258,36 @@
       <w:pPr>
         <w:pStyle w:val="Nadpis2"/>
       </w:pPr>
-      <w:bookmarkStart w:id="42" w:name="_Toc227668226"/>
-      <w:r>
-        <w:t>Motivace a sdílení</w:t>
+      <w:bookmarkStart w:id="42" w:name="_Toc227677884"/>
+      <w:r>
+        <w:t>Systém vnořených klubů</w:t>
       </w:r>
       <w:bookmarkEnd w:id="42"/>
     </w:p>
     <w:p>
       <w:pPr>
-        <w:pStyle w:val="Nadpis2"/>
-      </w:pPr>
-      <w:bookmarkStart w:id="43" w:name="_Toc227668227"/>
-      <w:r>
-        <w:t>Gamifikace</w:t>
+        <w:pStyle w:val="Nadpis1"/>
+      </w:pPr>
+      <w:bookmarkStart w:id="43" w:name="_Toc227677885"/>
+      <w:r>
+        <w:lastRenderedPageBreak/>
+        <w:t>Byznys model</w:t>
+      </w:r>
+      <w:r>
+        <w:t xml:space="preserve"> </w:t>
+      </w:r>
+      <w:r>
+        <w:t>a ekonomika provozu</w:t>
       </w:r>
       <w:bookmarkEnd w:id="43"/>
     </w:p>
     <w:p>
       <w:pPr>
-        <w:pStyle w:val="Nadpis1"/>
-      </w:pPr>
-      <w:bookmarkStart w:id="44" w:name="_Toc227668228"/>
-      <w:r>
-        <w:lastRenderedPageBreak/>
-        <w:t>Byznys model</w:t>
-      </w:r>
-      <w:r>
-        <w:t xml:space="preserve"> </w:t>
-      </w:r>
-      <w:r>
-        <w:t>a ekonomika provozu</w:t>
+        <w:pStyle w:val="Nadpis2"/>
+      </w:pPr>
+      <w:bookmarkStart w:id="44" w:name="_Toc227677886"/>
+      <w:r>
+        <w:t>Ekonomika AI požadavků a reklamy</w:t>
       </w:r>
       <w:bookmarkEnd w:id="44"/>
     </w:p>
@@ -6849,9 +7295,20 @@
       <w:pPr>
         <w:pStyle w:val="Nadpis2"/>
       </w:pPr>
-      <w:bookmarkStart w:id="45" w:name="_Toc227668229"/>
-      <w:r>
-        <w:t>Ekonomika AI požadavků a reklamy</w:t>
+      <w:bookmarkStart w:id="45" w:name="_Toc227677887"/>
+      <w:r>
+        <w:t>Model předplatného (</w:t>
+      </w:r>
+      <w:proofErr w:type="spellStart"/>
+      <w:r>
+        <w:t>Yumi</w:t>
+      </w:r>
+      <w:proofErr w:type="spellEnd"/>
+      <w:r>
+        <w:t>+</w:t>
+      </w:r>
+      <w:r>
+        <w:t>)</w:t>
       </w:r>
       <w:bookmarkEnd w:id="45"/>
     </w:p>
@@ -6859,30 +7316,20 @@
       <w:pPr>
         <w:pStyle w:val="Nadpis2"/>
       </w:pPr>
-      <w:bookmarkStart w:id="46" w:name="_Toc227668230"/>
-      <w:r>
-        <w:t>Model předplatného (</w:t>
-      </w:r>
-      <w:proofErr w:type="spellStart"/>
-      <w:r>
-        <w:t>Yumi</w:t>
-      </w:r>
-      <w:proofErr w:type="spellEnd"/>
-      <w:r>
-        <w:t>+</w:t>
-      </w:r>
-      <w:r>
-        <w:t>)</w:t>
+      <w:bookmarkStart w:id="46" w:name="_Toc227677888"/>
+      <w:r>
+        <w:t>Platební brána Stripe a správa transakcí</w:t>
       </w:r>
       <w:bookmarkEnd w:id="46"/>
     </w:p>
     <w:p>
       <w:pPr>
-        <w:pStyle w:val="Nadpis2"/>
-      </w:pPr>
-      <w:bookmarkStart w:id="47" w:name="_Toc227668231"/>
-      <w:r>
-        <w:t>Platební brána Stripe a správa transakcí</w:t>
+        <w:pStyle w:val="Nadpis1"/>
+      </w:pPr>
+      <w:bookmarkStart w:id="47" w:name="_Toc227677889"/>
+      <w:r>
+        <w:lastRenderedPageBreak/>
+        <w:t>Distribuce a správa vývojářských účtů</w:t>
       </w:r>
       <w:bookmarkEnd w:id="47"/>
     </w:p>
@@ -6890,150 +7337,181 @@
       <w:pPr>
         <w:pStyle w:val="Nadpis2"/>
       </w:pPr>
-      <w:bookmarkStart w:id="48" w:name="_Toc227668232"/>
-      <w:r>
-        <w:t>Distribuce přes Apple a Google</w:t>
+      <w:bookmarkStart w:id="48" w:name="_Toc227677890"/>
+      <w:r>
+        <w:t>Apple Developer Program</w:t>
       </w:r>
       <w:bookmarkEnd w:id="48"/>
     </w:p>
     <w:p>
       <w:pPr>
-        <w:pStyle w:val="Nadpis1"/>
-      </w:pPr>
-      <w:bookmarkStart w:id="49" w:name="_Toc227668233"/>
-      <w:r>
-        <w:lastRenderedPageBreak/>
-        <w:t>Distribuce a správa vývojářských účtů</w:t>
+        <w:pStyle w:val="Nadpis2"/>
+      </w:pPr>
+      <w:bookmarkStart w:id="49" w:name="_Toc227677891"/>
+      <w:r>
+        <w:t xml:space="preserve">Google Play </w:t>
+      </w:r>
+      <w:proofErr w:type="spellStart"/>
+      <w:r>
+        <w:t>Console</w:t>
       </w:r>
       <w:bookmarkEnd w:id="49"/>
+      <w:proofErr w:type="spellEnd"/>
     </w:p>
     <w:p>
       <w:pPr>
-        <w:pStyle w:val="Nadpis2"/>
-      </w:pPr>
-      <w:bookmarkStart w:id="50" w:name="_Toc227668234"/>
-      <w:r>
-        <w:t>Apple Developer Program</w:t>
+        <w:pStyle w:val="Nadpis1"/>
+      </w:pPr>
+      <w:bookmarkStart w:id="50" w:name="_Toc227677892"/>
+      <w:r>
+        <w:lastRenderedPageBreak/>
+        <w:t>Testování aplikace</w:t>
       </w:r>
       <w:bookmarkEnd w:id="50"/>
     </w:p>
     <w:p>
       <w:pPr>
-        <w:pStyle w:val="Nadpis2"/>
-      </w:pPr>
-      <w:bookmarkStart w:id="51" w:name="_Toc227668235"/>
-      <w:r>
-        <w:t xml:space="preserve">Google Play </w:t>
+        <w:pStyle w:val="Nadpis1"/>
+      </w:pPr>
+      <w:bookmarkStart w:id="51" w:name="_Toc227677893"/>
+      <w:r>
+        <w:lastRenderedPageBreak/>
+        <w:t xml:space="preserve">Nasazení </w:t>
       </w:r>
       <w:proofErr w:type="spellStart"/>
       <w:r>
-        <w:t>Console</w:t>
+        <w:t>PostHog</w:t>
+      </w:r>
+      <w:proofErr w:type="spellEnd"/>
+      <w:r>
+        <w:t xml:space="preserve"> </w:t>
+      </w:r>
+      <w:proofErr w:type="spellStart"/>
+      <w:r>
+        <w:t>analytic</w:t>
       </w:r>
       <w:bookmarkEnd w:id="51"/>
       <w:proofErr w:type="spellEnd"/>
     </w:p>
     <w:p>
       <w:pPr>
-        <w:pStyle w:val="Nadpis2"/>
-      </w:pPr>
-      <w:bookmarkStart w:id="52" w:name="_Toc227668236"/>
-      <w:r>
-        <w:t>API Management</w:t>
+        <w:pStyle w:val="Nadpis1"/>
+      </w:pPr>
+      <w:bookmarkStart w:id="52" w:name="_Toc227677894"/>
+      <w:r>
+        <w:lastRenderedPageBreak/>
+        <w:t>Testování s uživateli</w:t>
       </w:r>
       <w:bookmarkEnd w:id="52"/>
     </w:p>
-    <w:p/>
     <w:p>
       <w:pPr>
-        <w:pStyle w:val="ObrzekvMP"/>
-      </w:pPr>
+        <w:pStyle w:val="Nadpis1"/>
+      </w:pPr>
+      <w:bookmarkStart w:id="53" w:name="_Toc227677895"/>
+      <w:r>
+        <w:lastRenderedPageBreak/>
+        <w:t>Optimalizace aplikace z pohledu UX</w:t>
+      </w:r>
+      <w:bookmarkEnd w:id="53"/>
     </w:p>
     <w:p>
       <w:pPr>
+        <w:pStyle w:val="Nadpis1"/>
+      </w:pPr>
+      <w:bookmarkStart w:id="54" w:name="_Toc227677896"/>
+      <w:r>
+        <w:lastRenderedPageBreak/>
+        <w:t>Využití AI v projektu</w:t>
+      </w:r>
+      <w:bookmarkEnd w:id="54"/>
+    </w:p>
+    <w:p>
+      <w:pPr>
+        <w:pStyle w:val="ObrzekvMP"/>
+      </w:pPr>
+    </w:p>
+    <w:p>
+      <w:pPr>
         <w:pStyle w:val="Neslovannadpis"/>
       </w:pPr>
-      <w:bookmarkStart w:id="53" w:name="_Toc86047603"/>
-      <w:bookmarkStart w:id="54" w:name="_Toc86055210"/>
-      <w:bookmarkStart w:id="55" w:name="_Toc227668237"/>
+      <w:bookmarkStart w:id="55" w:name="_Toc86047603"/>
+      <w:bookmarkStart w:id="56" w:name="_Toc86055210"/>
+      <w:bookmarkStart w:id="57" w:name="_Toc227677897"/>
       <w:r>
         <w:lastRenderedPageBreak/>
         <w:t>Závěr</w:t>
       </w:r>
-      <w:bookmarkEnd w:id="53"/>
-      <w:bookmarkEnd w:id="54"/>
       <w:bookmarkEnd w:id="55"/>
+      <w:bookmarkEnd w:id="56"/>
+      <w:bookmarkEnd w:id="57"/>
     </w:p>
     <w:p>
-      <w:r>
-        <w:t>Tak jsem se dostal až na konec.</w:t>
-      </w:r>
+      <w:pPr>
+        <w:pStyle w:val="Neslovannadpis"/>
+      </w:pPr>
+      <w:bookmarkStart w:id="58" w:name="_Toc86047604"/>
+      <w:bookmarkStart w:id="59" w:name="_Toc86055211"/>
+      <w:bookmarkStart w:id="60" w:name="_Toc227677898"/>
+      <w:r>
+        <w:lastRenderedPageBreak/>
+        <w:t>Seznam zkratek a odborných výrazů</w:t>
+      </w:r>
+      <w:bookmarkEnd w:id="58"/>
+      <w:bookmarkEnd w:id="59"/>
+      <w:bookmarkEnd w:id="60"/>
     </w:p>
     <w:p>
       <w:pPr>
-        <w:pStyle w:val="Neslovannadpis"/>
-      </w:pPr>
-      <w:bookmarkStart w:id="56" w:name="_Toc86047604"/>
-      <w:bookmarkStart w:id="57" w:name="_Toc86055211"/>
-      <w:bookmarkStart w:id="58" w:name="_Toc227668238"/>
-      <w:r>
-        <w:lastRenderedPageBreak/>
-        <w:t>Seznam zkratek a odborných výrazů</w:t>
-      </w:r>
-      <w:bookmarkEnd w:id="56"/>
-      <w:bookmarkEnd w:id="57"/>
-      <w:bookmarkEnd w:id="58"/>
+        <w:pStyle w:val="Pojem"/>
+      </w:pPr>
+      <w:r>
+        <w:t>HTML</w:t>
+      </w:r>
     </w:p>
     <w:p>
       <w:pPr>
-        <w:pStyle w:val="Pojem"/>
-      </w:pPr>
-      <w:r>
-        <w:t>HTML</w:t>
+        <w:pStyle w:val="Vysvtlenpojmu"/>
+      </w:pPr>
+      <w:proofErr w:type="spellStart"/>
+      <w:r>
+        <w:t>HyperText</w:t>
+      </w:r>
+      <w:proofErr w:type="spellEnd"/>
+      <w:r>
+        <w:t xml:space="preserve"> </w:t>
+      </w:r>
+      <w:proofErr w:type="spellStart"/>
+      <w:r>
+        <w:t>Markup</w:t>
+      </w:r>
+      <w:proofErr w:type="spellEnd"/>
+      <w:r>
+        <w:t xml:space="preserve"> </w:t>
+      </w:r>
+      <w:proofErr w:type="spellStart"/>
+      <w:r>
+        <w:t>Language</w:t>
+      </w:r>
+      <w:proofErr w:type="spellEnd"/>
+      <w:r>
+        <w:t xml:space="preserve"> – značkovací jazyk používaný pro tvorbu webových stránek.</w:t>
       </w:r>
     </w:p>
     <w:p>
       <w:pPr>
-        <w:pStyle w:val="Vysvtlenpojmu"/>
-      </w:pPr>
-      <w:proofErr w:type="spellStart"/>
-      <w:r>
-        <w:t>HyperText</w:t>
-      </w:r>
-      <w:proofErr w:type="spellEnd"/>
-      <w:r>
-        <w:t xml:space="preserve"> </w:t>
-      </w:r>
-      <w:proofErr w:type="spellStart"/>
-      <w:r>
-        <w:t>Markup</w:t>
-      </w:r>
-      <w:proofErr w:type="spellEnd"/>
-      <w:r>
-        <w:t xml:space="preserve"> </w:t>
-      </w:r>
-      <w:proofErr w:type="spellStart"/>
-      <w:r>
-        <w:t>Language</w:t>
-      </w:r>
-      <w:proofErr w:type="spellEnd"/>
-      <w:r>
-        <w:t xml:space="preserve"> – značkovací jazyk používaný pro tvorbu webových stránek.</w:t>
-      </w:r>
-    </w:p>
-    <w:p>
-      <w:pPr>
         <w:pStyle w:val="Neslovannadpis"/>
       </w:pPr>
-      <w:bookmarkStart w:id="59" w:name="_Toc86047605"/>
-      <w:bookmarkStart w:id="60" w:name="_Toc86055212"/>
-      <w:bookmarkStart w:id="61" w:name="_Toc227668239"/>
+      <w:bookmarkStart w:id="61" w:name="_Toc86047605"/>
+      <w:bookmarkStart w:id="62" w:name="_Toc86055212"/>
+      <w:bookmarkStart w:id="63" w:name="_Toc227677899"/>
       <w:r>
         <w:lastRenderedPageBreak/>
         <w:t>Seznam obrázků</w:t>
       </w:r>
-      <w:bookmarkEnd w:id="59"/>
-      <w:bookmarkEnd w:id="60"/>
       <w:bookmarkEnd w:id="61"/>
+      <w:bookmarkEnd w:id="62"/>
+      <w:bookmarkEnd w:id="63"/>
     </w:p>
     <w:p>
       <w:pPr>
@@ -7197,10 +7675,10 @@
       <w:r>
         <w:fldChar w:fldCharType="end"/>
       </w:r>
-      <w:bookmarkStart w:id="62" w:name="_Toc86047606"/>
+      <w:bookmarkStart w:id="64" w:name="_Toc86047606"/>
     </w:p>
-    <w:bookmarkStart w:id="63" w:name="_Toc227668240" w:displacedByCustomXml="next"/>
-    <w:bookmarkStart w:id="64" w:name="_Toc86055213" w:displacedByCustomXml="next"/>
+    <w:bookmarkStart w:id="65" w:name="_Toc86055213" w:displacedByCustomXml="next"/>
+    <w:bookmarkStart w:id="66" w:name="_Toc227677900" w:displacedByCustomXml="next"/>
     <w:sdt>
       <w:sdtPr>
         <w:rPr>
@@ -7228,9 +7706,9 @@
           <w:r>
             <w:t>Použité zdroje</w:t>
           </w:r>
-          <w:bookmarkEnd w:id="62"/>
           <w:bookmarkEnd w:id="64"/>
-          <w:bookmarkEnd w:id="63"/>
+          <w:bookmarkEnd w:id="66"/>
+          <w:bookmarkEnd w:id="65"/>
         </w:p>
         <w:p>
           <w:pPr>
@@ -7311,16 +7789,16 @@
       <w:pPr>
         <w:pStyle w:val="Nadpisplohy"/>
       </w:pPr>
-      <w:bookmarkStart w:id="65" w:name="_Toc86047607"/>
-      <w:bookmarkStart w:id="66" w:name="_Toc86055214"/>
-      <w:bookmarkStart w:id="67" w:name="_Toc227668241"/>
+      <w:bookmarkStart w:id="67" w:name="_Toc86047607"/>
+      <w:bookmarkStart w:id="68" w:name="_Toc86055214"/>
+      <w:bookmarkStart w:id="69" w:name="_Toc227677901"/>
       <w:r>
         <w:lastRenderedPageBreak/>
         <w:t>Seznam přiložených souborů</w:t>
       </w:r>
-      <w:bookmarkEnd w:id="65"/>
-      <w:bookmarkEnd w:id="66"/>
       <w:bookmarkEnd w:id="67"/>
+      <w:bookmarkEnd w:id="68"/>
+      <w:bookmarkEnd w:id="69"/>
     </w:p>
     <w:p>
       <w:r>
@@ -9460,6 +9938,7 @@
   <w:style w:type="character" w:default="1" w:styleId="Standardnpsmoodstavce">
     <w:name w:val="Default Paragraph Font"/>
     <w:uiPriority w:val="1"/>
+    <w:semiHidden/>
     <w:unhideWhenUsed/>
   </w:style>
   <w:style w:type="table" w:default="1" w:styleId="Normlntabulka">
@@ -10311,12 +10790,16 @@
   </w:compat>
   <w:rsids>
     <w:rsidRoot w:val="00FD6AF4"/>
+    <w:rsid w:val="001401DF"/>
     <w:rsid w:val="004064D7"/>
+    <w:rsid w:val="00557DCD"/>
     <w:rsid w:val="0063099A"/>
+    <w:rsid w:val="007D04CB"/>
     <w:rsid w:val="00947743"/>
     <w:rsid w:val="009F144A"/>
     <w:rsid w:val="00B1330D"/>
     <w:rsid w:val="00B2623B"/>
+    <w:rsid w:val="00E40391"/>
     <w:rsid w:val="00FD6AF4"/>
   </w:rsids>
   <m:mathPr>

</xml_diff>